<commit_message>
cours maquettage + maquettage fil rouge
</commit_message>
<xml_diff>
--- a/cours anglais/TOEIC TEST 1 PrepmyFuture (1).docx
+++ b/cours anglais/TOEIC TEST 1 PrepmyFuture (1).docx
@@ -267,10 +267,7 @@
         </w:tc>
       </w:tr>
     </w:tbl>
-    <w:p>
-      <w:bookmarkStart w:id="0" w:name="_GoBack"/>
-      <w:bookmarkEnd w:id="0"/>
-    </w:p>
+    <w:p/>
     <w:p>
       <w:r>
         <w:rPr>
@@ -10244,7 +10241,7 @@
                     </wp:anchor>
                   </w:drawing>
                 </mc:Choice>
-                <mc:Fallback xmlns:cr="http://schemas.microsoft.com/office/comments/2020/reactions" xmlns="http://schemas.microsoft.com/office/tasks/2019/documenttasks" xmlns:w16cid="http://schemas.microsoft.com/office/word/2016/wordml/cid" xmlns:w16cex="http://schemas.microsoft.com/office/word/2018/wordml/cex" xmlns:w16="http://schemas.microsoft.com/office/word/2018/wordml" xmlns:dgm="http://schemas.openxmlformats.org/drawingml/2006/diagram" xmlns:lc="http://schemas.openxmlformats.org/drawingml/2006/lockedCanvas" xmlns:c="http://schemas.openxmlformats.org/drawingml/2006/chart" xmlns:pic="http://schemas.openxmlformats.org/drawingml/2006/picture" xmlns:a="http://schemas.openxmlformats.org/drawingml/2006/main" xmlns:sl="http://schemas.openxmlformats.org/schemaLibrary/2006/main">
+                <mc:Fallback xmlns:sl="http://schemas.openxmlformats.org/schemaLibrary/2006/main" xmlns:a="http://schemas.openxmlformats.org/drawingml/2006/main" xmlns:pic="http://schemas.openxmlformats.org/drawingml/2006/picture" xmlns:c="http://schemas.openxmlformats.org/drawingml/2006/chart" xmlns:lc="http://schemas.openxmlformats.org/drawingml/2006/lockedCanvas" xmlns:dgm="http://schemas.openxmlformats.org/drawingml/2006/diagram" xmlns:w16="http://schemas.microsoft.com/office/word/2018/wordml" xmlns:w16cex="http://schemas.microsoft.com/office/word/2018/wordml/cex" xmlns:w16cid="http://schemas.microsoft.com/office/word/2016/wordml/cid" xmlns="http://schemas.microsoft.com/office/tasks/2019/documenttasks" xmlns:cr="http://schemas.microsoft.com/office/comments/2020/reactions">
                   <w:drawing>
                     <wp:anchor allowOverlap="1" behindDoc="0" distB="0" distT="0" distL="114300" distR="114300" hidden="0" layoutInCell="1" locked="0" relativeHeight="0" simplePos="0">
                       <wp:simplePos x="0" y="0"/>
@@ -11596,7 +11593,22 @@
           <w:sz w:val="24"/>
         </w:rPr>
         <w:br/>
-        <w:t xml:space="preserve">B as well as </w:t>
+        <w:t xml:space="preserve">B </w:t>
+      </w:r>
+      <w:r>
+        <w:rPr>
+          <w:rFonts w:eastAsia="Calibri" w:cs="Calibri"/>
+          <w:sz w:val="24"/>
+          <w:highlight w:val="yellow"/>
+        </w:rPr>
+        <w:t>as well as</w:t>
+      </w:r>
+      <w:r>
+        <w:rPr>
+          <w:rFonts w:eastAsia="Calibri" w:cs="Calibri"/>
+          <w:sz w:val="24"/>
+        </w:rPr>
+        <w:t xml:space="preserve"> </w:t>
       </w:r>
       <w:r>
         <w:rPr>
@@ -11654,7 +11666,15 @@
           <w:sz w:val="24"/>
         </w:rPr>
         <w:br/>
-        <w:t>B while</w:t>
+        <w:t xml:space="preserve">B </w:t>
+      </w:r>
+      <w:r>
+        <w:rPr>
+          <w:rFonts w:eastAsia="Calibri" w:cs="Calibri"/>
+          <w:sz w:val="24"/>
+          <w:highlight w:val="yellow"/>
+        </w:rPr>
+        <w:t>while</w:t>
       </w:r>
       <w:r>
         <w:rPr>
@@ -11670,7 +11690,15 @@
           <w:sz w:val="24"/>
         </w:rPr>
         <w:br/>
-        <w:t>D when</w:t>
+        <w:t xml:space="preserve">D </w:t>
+      </w:r>
+      <w:r>
+        <w:rPr>
+          <w:rFonts w:eastAsia="Calibri" w:cs="Calibri"/>
+          <w:sz w:val="24"/>
+          <w:highlight w:val="red"/>
+        </w:rPr>
+        <w:t>when</w:t>
       </w:r>
     </w:p>
     <w:p>
@@ -11704,7 +11732,15 @@
           <w:rFonts w:eastAsia="Calibri" w:cs="Calibri"/>
           <w:sz w:val="24"/>
         </w:rPr>
-        <w:t>A was being made</w:t>
+        <w:t xml:space="preserve">A </w:t>
+      </w:r>
+      <w:r>
+        <w:rPr>
+          <w:rFonts w:eastAsia="Calibri" w:cs="Calibri"/>
+          <w:sz w:val="24"/>
+          <w:highlight w:val="red"/>
+        </w:rPr>
+        <w:t>was being made</w:t>
       </w:r>
       <w:r>
         <w:rPr>
@@ -11712,7 +11748,22 @@
           <w:sz w:val="24"/>
         </w:rPr>
         <w:br/>
-        <w:t xml:space="preserve">B has been made </w:t>
+        <w:t xml:space="preserve">B </w:t>
+      </w:r>
+      <w:r>
+        <w:rPr>
+          <w:rFonts w:eastAsia="Calibri" w:cs="Calibri"/>
+          <w:sz w:val="24"/>
+          <w:highlight w:val="yellow"/>
+        </w:rPr>
+        <w:t>has been made</w:t>
+      </w:r>
+      <w:r>
+        <w:rPr>
+          <w:rFonts w:eastAsia="Calibri" w:cs="Calibri"/>
+          <w:sz w:val="24"/>
+        </w:rPr>
+        <w:t xml:space="preserve"> </w:t>
       </w:r>
       <w:r>
         <w:rPr>
@@ -11778,7 +11829,15 @@
           <w:sz w:val="24"/>
         </w:rPr>
         <w:br/>
-        <w:t>C will be returned</w:t>
+        <w:t xml:space="preserve">C </w:t>
+      </w:r>
+      <w:r>
+        <w:rPr>
+          <w:rFonts w:eastAsia="Calibri" w:cs="Calibri"/>
+          <w:sz w:val="24"/>
+          <w:highlight w:val="yellow"/>
+        </w:rPr>
+        <w:t>will be returned</w:t>
       </w:r>
       <w:r>
         <w:rPr>
@@ -11820,7 +11879,22 @@
           <w:rFonts w:eastAsia="Calibri" w:cs="Calibri"/>
           <w:sz w:val="24"/>
         </w:rPr>
-        <w:t xml:space="preserve">A has already </w:t>
+        <w:t xml:space="preserve">A </w:t>
+      </w:r>
+      <w:r>
+        <w:rPr>
+          <w:rFonts w:eastAsia="Calibri" w:cs="Calibri"/>
+          <w:sz w:val="24"/>
+          <w:highlight w:val="red"/>
+        </w:rPr>
+        <w:t>has already</w:t>
+      </w:r>
+      <w:r>
+        <w:rPr>
+          <w:rFonts w:eastAsia="Calibri" w:cs="Calibri"/>
+          <w:sz w:val="24"/>
+        </w:rPr>
+        <w:t xml:space="preserve"> </w:t>
       </w:r>
       <w:r>
         <w:rPr>
@@ -11843,7 +11917,22 @@
           <w:sz w:val="24"/>
         </w:rPr>
         <w:lastRenderedPageBreak/>
-        <w:t xml:space="preserve">C has still </w:t>
+        <w:t xml:space="preserve">C </w:t>
+      </w:r>
+      <w:r>
+        <w:rPr>
+          <w:rFonts w:eastAsia="Calibri" w:cs="Calibri"/>
+          <w:sz w:val="24"/>
+          <w:highlight w:val="yellow"/>
+        </w:rPr>
+        <w:t>has still</w:t>
+      </w:r>
+      <w:r>
+        <w:rPr>
+          <w:rFonts w:eastAsia="Calibri" w:cs="Calibri"/>
+          <w:sz w:val="24"/>
+        </w:rPr>
+        <w:t xml:space="preserve"> </w:t>
       </w:r>
       <w:r>
         <w:rPr>
@@ -11885,7 +11974,15 @@
           <w:rFonts w:eastAsia="Calibri" w:cs="Calibri"/>
           <w:sz w:val="24"/>
         </w:rPr>
-        <w:t>A looked into</w:t>
+        <w:t xml:space="preserve">A </w:t>
+      </w:r>
+      <w:r>
+        <w:rPr>
+          <w:rFonts w:eastAsia="Calibri" w:cs="Calibri"/>
+          <w:sz w:val="24"/>
+          <w:highlight w:val="yellow"/>
+        </w:rPr>
+        <w:t>looked into</w:t>
       </w:r>
       <w:r>
         <w:rPr>
@@ -11901,7 +11998,22 @@
           <w:sz w:val="24"/>
         </w:rPr>
         <w:br/>
-        <w:t xml:space="preserve">C turned into </w:t>
+        <w:t xml:space="preserve">C </w:t>
+      </w:r>
+      <w:r>
+        <w:rPr>
+          <w:rFonts w:eastAsia="Calibri" w:cs="Calibri"/>
+          <w:sz w:val="24"/>
+          <w:highlight w:val="red"/>
+        </w:rPr>
+        <w:t>turned into</w:t>
+      </w:r>
+      <w:r>
+        <w:rPr>
+          <w:rFonts w:eastAsia="Calibri" w:cs="Calibri"/>
+          <w:sz w:val="24"/>
+        </w:rPr>
+        <w:t xml:space="preserve"> </w:t>
       </w:r>
       <w:r>
         <w:rPr>
@@ -11943,7 +12055,15 @@
           <w:rFonts w:eastAsia="Calibri" w:cs="Calibri"/>
           <w:sz w:val="24"/>
         </w:rPr>
-        <w:t>A drop</w:t>
+        <w:t xml:space="preserve">A </w:t>
+      </w:r>
+      <w:r>
+        <w:rPr>
+          <w:rFonts w:eastAsia="Calibri" w:cs="Calibri"/>
+          <w:sz w:val="24"/>
+          <w:highlight w:val="yellow"/>
+        </w:rPr>
+        <w:t>drop</w:t>
       </w:r>
       <w:r>
         <w:rPr>
@@ -12019,7 +12139,15 @@
           <w:rFonts w:eastAsia="Calibri" w:cs="Calibri"/>
           <w:sz w:val="24"/>
         </w:rPr>
-        <w:t>A to arrange</w:t>
+        <w:t xml:space="preserve">A </w:t>
+      </w:r>
+      <w:r>
+        <w:rPr>
+          <w:rFonts w:eastAsia="Calibri" w:cs="Calibri"/>
+          <w:sz w:val="24"/>
+          <w:highlight w:val="yellow"/>
+        </w:rPr>
+        <w:t>to arrange</w:t>
       </w:r>
       <w:r>
         <w:rPr>
@@ -12035,7 +12163,15 @@
           <w:sz w:val="24"/>
         </w:rPr>
         <w:br/>
-        <w:t>C arranged</w:t>
+        <w:t xml:space="preserve">C </w:t>
+      </w:r>
+      <w:r>
+        <w:rPr>
+          <w:rFonts w:eastAsia="Calibri" w:cs="Calibri"/>
+          <w:sz w:val="24"/>
+          <w:highlight w:val="red"/>
+        </w:rPr>
+        <w:t>arranged</w:t>
       </w:r>
       <w:r>
         <w:rPr>
@@ -12085,7 +12221,15 @@
           <w:sz w:val="24"/>
         </w:rPr>
         <w:br/>
-        <w:t>B yet</w:t>
+        <w:t xml:space="preserve">B </w:t>
+      </w:r>
+      <w:r>
+        <w:rPr>
+          <w:rFonts w:eastAsia="Calibri" w:cs="Calibri"/>
+          <w:sz w:val="24"/>
+          <w:highlight w:val="yellow"/>
+        </w:rPr>
+        <w:t>yet</w:t>
       </w:r>
       <w:r>
         <w:rPr>
@@ -12101,7 +12245,15 @@
           <w:sz w:val="24"/>
         </w:rPr>
         <w:br/>
-        <w:t>D thus</w:t>
+        <w:t xml:space="preserve">D </w:t>
+      </w:r>
+      <w:r>
+        <w:rPr>
+          <w:rFonts w:eastAsia="Calibri" w:cs="Calibri"/>
+          <w:sz w:val="24"/>
+          <w:highlight w:val="red"/>
+        </w:rPr>
+        <w:t>thus</w:t>
       </w:r>
     </w:p>
     <w:p>
@@ -12143,7 +12295,15 @@
           <w:sz w:val="24"/>
         </w:rPr>
         <w:br/>
-        <w:t>B yet</w:t>
+        <w:t xml:space="preserve">B </w:t>
+      </w:r>
+      <w:r>
+        <w:rPr>
+          <w:rFonts w:eastAsia="Calibri" w:cs="Calibri"/>
+          <w:sz w:val="24"/>
+          <w:highlight w:val="red"/>
+        </w:rPr>
+        <w:t>yet</w:t>
       </w:r>
       <w:r>
         <w:rPr>
@@ -12159,7 +12319,15 @@
           <w:sz w:val="24"/>
         </w:rPr>
         <w:br/>
-        <w:t>D finally</w:t>
+        <w:t xml:space="preserve">D </w:t>
+      </w:r>
+      <w:r>
+        <w:rPr>
+          <w:rFonts w:eastAsia="Calibri" w:cs="Calibri"/>
+          <w:sz w:val="24"/>
+          <w:highlight w:val="yellow"/>
+        </w:rPr>
+        <w:t>finally</w:t>
       </w:r>
     </w:p>
     <w:p>
@@ -12193,7 +12361,15 @@
           <w:rFonts w:eastAsia="Calibri" w:cs="Calibri"/>
           <w:sz w:val="24"/>
         </w:rPr>
-        <w:t>A personnel</w:t>
+        <w:t xml:space="preserve">A </w:t>
+      </w:r>
+      <w:r>
+        <w:rPr>
+          <w:rFonts w:eastAsia="Calibri" w:cs="Calibri"/>
+          <w:sz w:val="24"/>
+          <w:highlight w:val="red"/>
+        </w:rPr>
+        <w:t>personnel</w:t>
       </w:r>
       <w:r>
         <w:rPr>
@@ -12216,7 +12392,15 @@
           <w:sz w:val="24"/>
         </w:rPr>
         <w:lastRenderedPageBreak/>
-        <w:t>C personal</w:t>
+        <w:t xml:space="preserve">C </w:t>
+      </w:r>
+      <w:r>
+        <w:rPr>
+          <w:rFonts w:eastAsia="Calibri" w:cs="Calibri"/>
+          <w:sz w:val="24"/>
+          <w:highlight w:val="yellow"/>
+        </w:rPr>
+        <w:t>personal</w:t>
       </w:r>
       <w:r>
         <w:rPr>
@@ -12282,7 +12466,15 @@
           <w:sz w:val="24"/>
         </w:rPr>
         <w:br/>
-        <w:t>D but</w:t>
+        <w:t xml:space="preserve">D </w:t>
+      </w:r>
+      <w:r>
+        <w:rPr>
+          <w:rFonts w:eastAsia="Calibri" w:cs="Calibri"/>
+          <w:sz w:val="24"/>
+          <w:highlight w:val="yellow"/>
+        </w:rPr>
+        <w:t>but</w:t>
       </w:r>
     </w:p>
     <w:p>
@@ -12332,7 +12524,15 @@
           <w:sz w:val="24"/>
         </w:rPr>
         <w:br/>
-        <w:t>C before</w:t>
+        <w:t xml:space="preserve">C </w:t>
+      </w:r>
+      <w:r>
+        <w:rPr>
+          <w:rFonts w:eastAsia="Calibri" w:cs="Calibri"/>
+          <w:sz w:val="24"/>
+          <w:highlight w:val="yellow"/>
+        </w:rPr>
+        <w:t>before</w:t>
       </w:r>
       <w:r>
         <w:rPr>
@@ -12400,7 +12600,15 @@
           <w:sz w:val="24"/>
         </w:rPr>
         <w:br/>
-        <w:t>B to</w:t>
+        <w:t xml:space="preserve">B </w:t>
+      </w:r>
+      <w:r>
+        <w:rPr>
+          <w:rFonts w:eastAsia="Calibri" w:cs="Calibri"/>
+          <w:sz w:val="24"/>
+          <w:highlight w:val="yellow"/>
+        </w:rPr>
+        <w:t>to</w:t>
       </w:r>
       <w:r>
         <w:rPr>
@@ -12458,7 +12666,15 @@
           <w:rFonts w:eastAsia="Calibri" w:cs="Calibri"/>
           <w:sz w:val="24"/>
         </w:rPr>
-        <w:t>A with</w:t>
+        <w:t xml:space="preserve">A </w:t>
+      </w:r>
+      <w:r>
+        <w:rPr>
+          <w:rFonts w:eastAsia="Calibri" w:cs="Calibri"/>
+          <w:sz w:val="24"/>
+          <w:highlight w:val="red"/>
+        </w:rPr>
+        <w:t>with</w:t>
       </w:r>
       <w:r>
         <w:rPr>
@@ -12474,7 +12690,15 @@
           <w:sz w:val="24"/>
         </w:rPr>
         <w:br/>
-        <w:t>C about</w:t>
+        <w:t xml:space="preserve">C </w:t>
+      </w:r>
+      <w:r>
+        <w:rPr>
+          <w:rFonts w:eastAsia="Calibri" w:cs="Calibri"/>
+          <w:sz w:val="24"/>
+          <w:highlight w:val="yellow"/>
+        </w:rPr>
+        <w:t>about</w:t>
       </w:r>
       <w:r>
         <w:rPr>
@@ -12542,7 +12766,15 @@
           <w:sz w:val="24"/>
         </w:rPr>
         <w:br/>
-        <w:t>B going over</w:t>
+        <w:t xml:space="preserve">B </w:t>
+      </w:r>
+      <w:r>
+        <w:rPr>
+          <w:rFonts w:eastAsia="Calibri" w:cs="Calibri"/>
+          <w:sz w:val="24"/>
+          <w:highlight w:val="yellow"/>
+        </w:rPr>
+        <w:t>going over</w:t>
       </w:r>
       <w:r>
         <w:rPr>
@@ -12558,7 +12790,15 @@
           <w:sz w:val="24"/>
         </w:rPr>
         <w:br/>
-        <w:t>D setting up</w:t>
+        <w:t xml:space="preserve">D </w:t>
+      </w:r>
+      <w:r>
+        <w:rPr>
+          <w:rFonts w:eastAsia="Calibri" w:cs="Calibri"/>
+          <w:sz w:val="24"/>
+          <w:highlight w:val="red"/>
+        </w:rPr>
+        <w:t>setting up</w:t>
       </w:r>
     </w:p>
     <w:p>
@@ -12600,7 +12840,15 @@
           <w:sz w:val="24"/>
         </w:rPr>
         <w:br/>
-        <w:t>B is</w:t>
+        <w:t xml:space="preserve">B </w:t>
+      </w:r>
+      <w:r>
+        <w:rPr>
+          <w:rFonts w:eastAsia="Calibri" w:cs="Calibri"/>
+          <w:sz w:val="24"/>
+          <w:highlight w:val="yellow"/>
+        </w:rPr>
+        <w:t>is</w:t>
       </w:r>
       <w:r>
         <w:rPr>
@@ -12651,7 +12899,15 @@
           <w:rFonts w:eastAsia="Calibri" w:cs="Calibri"/>
           <w:sz w:val="24"/>
         </w:rPr>
-        <w:t>A is</w:t>
+        <w:t xml:space="preserve">A </w:t>
+      </w:r>
+      <w:r>
+        <w:rPr>
+          <w:rFonts w:eastAsia="Calibri" w:cs="Calibri"/>
+          <w:sz w:val="24"/>
+          <w:highlight w:val="yellow"/>
+        </w:rPr>
+        <w:t>is</w:t>
       </w:r>
       <w:r>
         <w:rPr>
@@ -12725,7 +12981,15 @@
           <w:sz w:val="24"/>
         </w:rPr>
         <w:br/>
-        <w:t>C in the next year</w:t>
+        <w:t xml:space="preserve">C </w:t>
+      </w:r>
+      <w:r>
+        <w:rPr>
+          <w:rFonts w:eastAsia="Calibri" w:cs="Calibri"/>
+          <w:sz w:val="24"/>
+          <w:highlight w:val="yellow"/>
+        </w:rPr>
+        <w:t>in the next year</w:t>
       </w:r>
       <w:r>
         <w:rPr>
@@ -12775,7 +13039,15 @@
           <w:sz w:val="24"/>
         </w:rPr>
         <w:br/>
-        <w:t>B predominantly</w:t>
+        <w:t xml:space="preserve">B </w:t>
+      </w:r>
+      <w:r>
+        <w:rPr>
+          <w:rFonts w:eastAsia="Calibri" w:cs="Calibri"/>
+          <w:sz w:val="24"/>
+          <w:highlight w:val="red"/>
+        </w:rPr>
+        <w:t>predominantly</w:t>
       </w:r>
       <w:r>
         <w:rPr>
@@ -12783,7 +13055,15 @@
           <w:sz w:val="24"/>
         </w:rPr>
         <w:br/>
-        <w:t>C predominant</w:t>
+        <w:t xml:space="preserve">C </w:t>
+      </w:r>
+      <w:r>
+        <w:rPr>
+          <w:rFonts w:eastAsia="Calibri" w:cs="Calibri"/>
+          <w:sz w:val="24"/>
+          <w:highlight w:val="yellow"/>
+        </w:rPr>
+        <w:t>predominant</w:t>
       </w:r>
       <w:r>
         <w:rPr>
@@ -12851,7 +13131,15 @@
           <w:sz w:val="24"/>
         </w:rPr>
         <w:br/>
-        <w:t>B consequently</w:t>
+        <w:t xml:space="preserve">B </w:t>
+      </w:r>
+      <w:r>
+        <w:rPr>
+          <w:rFonts w:eastAsia="Calibri" w:cs="Calibri"/>
+          <w:sz w:val="24"/>
+          <w:highlight w:val="red"/>
+        </w:rPr>
+        <w:t>consequently</w:t>
       </w:r>
       <w:r>
         <w:rPr>
@@ -12859,7 +13147,22 @@
           <w:sz w:val="24"/>
         </w:rPr>
         <w:br/>
-        <w:t xml:space="preserve">C nevertheless </w:t>
+        <w:t xml:space="preserve">C </w:t>
+      </w:r>
+      <w:r>
+        <w:rPr>
+          <w:rFonts w:eastAsia="Calibri" w:cs="Calibri"/>
+          <w:sz w:val="24"/>
+          <w:highlight w:val="yellow"/>
+        </w:rPr>
+        <w:t>nevertheless</w:t>
+      </w:r>
+      <w:r>
+        <w:rPr>
+          <w:rFonts w:eastAsia="Calibri" w:cs="Calibri"/>
+          <w:sz w:val="24"/>
+        </w:rPr>
+        <w:t xml:space="preserve"> </w:t>
       </w:r>
       <w:r>
         <w:rPr>
@@ -12901,7 +13204,22 @@
           <w:rFonts w:eastAsia="Calibri" w:cs="Calibri"/>
           <w:sz w:val="24"/>
         </w:rPr>
-        <w:t xml:space="preserve">A advice </w:t>
+        <w:t xml:space="preserve">A </w:t>
+      </w:r>
+      <w:r>
+        <w:rPr>
+          <w:rFonts w:eastAsia="Calibri" w:cs="Calibri"/>
+          <w:sz w:val="24"/>
+          <w:highlight w:val="yellow"/>
+        </w:rPr>
+        <w:t>advice</w:t>
+      </w:r>
+      <w:r>
+        <w:rPr>
+          <w:rFonts w:eastAsia="Calibri" w:cs="Calibri"/>
+          <w:sz w:val="24"/>
+        </w:rPr>
+        <w:t xml:space="preserve"> </w:t>
       </w:r>
       <w:r>
         <w:rPr>
@@ -12925,7 +13243,22 @@
           <w:sz w:val="24"/>
         </w:rPr>
         <w:br/>
-        <w:t xml:space="preserve">D advance </w:t>
+        <w:t xml:space="preserve">D </w:t>
+      </w:r>
+      <w:r>
+        <w:rPr>
+          <w:rFonts w:eastAsia="Calibri" w:cs="Calibri"/>
+          <w:sz w:val="24"/>
+          <w:highlight w:val="red"/>
+        </w:rPr>
+        <w:t>advance</w:t>
+      </w:r>
+      <w:r>
+        <w:rPr>
+          <w:rFonts w:eastAsia="Calibri" w:cs="Calibri"/>
+          <w:sz w:val="24"/>
+        </w:rPr>
+        <w:t xml:space="preserve"> </w:t>
       </w:r>
     </w:p>
     <w:p>
@@ -12983,7 +13316,22 @@
           <w:sz w:val="24"/>
         </w:rPr>
         <w:br/>
-        <w:t xml:space="preserve">D accordingly </w:t>
+        <w:t xml:space="preserve">D </w:t>
+      </w:r>
+      <w:r>
+        <w:rPr>
+          <w:rFonts w:eastAsia="Calibri" w:cs="Calibri"/>
+          <w:sz w:val="24"/>
+          <w:highlight w:val="yellow"/>
+        </w:rPr>
+        <w:t>accordingly</w:t>
+      </w:r>
+      <w:r>
+        <w:rPr>
+          <w:rFonts w:eastAsia="Calibri" w:cs="Calibri"/>
+          <w:sz w:val="24"/>
+        </w:rPr>
+        <w:t xml:space="preserve"> </w:t>
       </w:r>
     </w:p>
     <w:p>
@@ -13044,7 +13392,22 @@
           <w:sz w:val="24"/>
         </w:rPr>
         <w:br/>
-        <w:t xml:space="preserve">B internal </w:t>
+        <w:t xml:space="preserve">B </w:t>
+      </w:r>
+      <w:r>
+        <w:rPr>
+          <w:rFonts w:eastAsia="Calibri" w:cs="Calibri"/>
+          <w:sz w:val="24"/>
+          <w:highlight w:val="yellow"/>
+        </w:rPr>
+        <w:t>internal</w:t>
+      </w:r>
+      <w:r>
+        <w:rPr>
+          <w:rFonts w:eastAsia="Calibri" w:cs="Calibri"/>
+          <w:sz w:val="24"/>
+        </w:rPr>
+        <w:t xml:space="preserve"> </w:t>
       </w:r>
       <w:r>
         <w:rPr>
@@ -13094,7 +13457,15 @@
           <w:rFonts w:eastAsia="Calibri" w:cs="Calibri"/>
           <w:sz w:val="24"/>
         </w:rPr>
-        <w:t>A advanced</w:t>
+        <w:t xml:space="preserve">A </w:t>
+      </w:r>
+      <w:r>
+        <w:rPr>
+          <w:rFonts w:eastAsia="Calibri" w:cs="Calibri"/>
+          <w:sz w:val="24"/>
+          <w:highlight w:val="red"/>
+        </w:rPr>
+        <w:t>advanced</w:t>
       </w:r>
       <w:r>
         <w:rPr>
@@ -13118,7 +13489,22 @@
           <w:sz w:val="24"/>
         </w:rPr>
         <w:br/>
-        <w:t xml:space="preserve">D advancement </w:t>
+        <w:t xml:space="preserve">D </w:t>
+      </w:r>
+      <w:r>
+        <w:rPr>
+          <w:rFonts w:eastAsia="Calibri" w:cs="Calibri"/>
+          <w:sz w:val="24"/>
+          <w:highlight w:val="yellow"/>
+        </w:rPr>
+        <w:t>advancement</w:t>
+      </w:r>
+      <w:r>
+        <w:rPr>
+          <w:rFonts w:eastAsia="Calibri" w:cs="Calibri"/>
+          <w:sz w:val="24"/>
+        </w:rPr>
+        <w:t xml:space="preserve"> </w:t>
       </w:r>
     </w:p>
     <w:p>
@@ -13160,7 +13546,22 @@
           <w:sz w:val="24"/>
         </w:rPr>
         <w:br/>
-        <w:t xml:space="preserve">B take it up </w:t>
+        <w:t xml:space="preserve">B </w:t>
+      </w:r>
+      <w:r>
+        <w:rPr>
+          <w:rFonts w:eastAsia="Calibri" w:cs="Calibri"/>
+          <w:sz w:val="24"/>
+          <w:highlight w:val="yellow"/>
+        </w:rPr>
+        <w:t>take it up</w:t>
+      </w:r>
+      <w:r>
+        <w:rPr>
+          <w:rFonts w:eastAsia="Calibri" w:cs="Calibri"/>
+          <w:sz w:val="24"/>
+        </w:rPr>
+        <w:t xml:space="preserve"> </w:t>
       </w:r>
       <w:r>
         <w:rPr>
@@ -13168,7 +13569,15 @@
           <w:sz w:val="24"/>
         </w:rPr>
         <w:br/>
-        <w:t>C look it over</w:t>
+        <w:t xml:space="preserve">C </w:t>
+      </w:r>
+      <w:r>
+        <w:rPr>
+          <w:rFonts w:eastAsia="Calibri" w:cs="Calibri"/>
+          <w:sz w:val="24"/>
+          <w:highlight w:val="red"/>
+        </w:rPr>
+        <w:t>look it over</w:t>
       </w:r>
       <w:r>
         <w:rPr>
@@ -13242,7 +13651,22 @@
           <w:sz w:val="24"/>
         </w:rPr>
         <w:br/>
-        <w:t xml:space="preserve">D delivered </w:t>
+        <w:t xml:space="preserve">D </w:t>
+      </w:r>
+      <w:r>
+        <w:rPr>
+          <w:rFonts w:eastAsia="Calibri" w:cs="Calibri"/>
+          <w:sz w:val="24"/>
+          <w:highlight w:val="yellow"/>
+        </w:rPr>
+        <w:t>delivered</w:t>
+      </w:r>
+      <w:r>
+        <w:rPr>
+          <w:rFonts w:eastAsia="Calibri" w:cs="Calibri"/>
+          <w:sz w:val="24"/>
+        </w:rPr>
+        <w:t xml:space="preserve"> </w:t>
       </w:r>
     </w:p>
     <w:p>
@@ -13293,7 +13717,15 @@
           <w:sz w:val="24"/>
         </w:rPr>
         <w:br/>
-        <w:t>B study</w:t>
+        <w:t xml:space="preserve">B </w:t>
+      </w:r>
+      <w:r>
+        <w:rPr>
+          <w:rFonts w:eastAsia="Calibri" w:cs="Calibri"/>
+          <w:sz w:val="24"/>
+          <w:highlight w:val="yellow"/>
+        </w:rPr>
+        <w:t>study</w:t>
       </w:r>
       <w:r>
         <w:rPr>
@@ -13343,7 +13775,15 @@
           <w:rFonts w:eastAsia="Calibri" w:cs="Calibri"/>
           <w:sz w:val="24"/>
         </w:rPr>
-        <w:t>A will be</w:t>
+        <w:t xml:space="preserve">A </w:t>
+      </w:r>
+      <w:r>
+        <w:rPr>
+          <w:rFonts w:eastAsia="Calibri" w:cs="Calibri"/>
+          <w:sz w:val="24"/>
+          <w:highlight w:val="yellow"/>
+        </w:rPr>
+        <w:t>will be</w:t>
       </w:r>
       <w:r>
         <w:rPr>
@@ -13419,7 +13859,22 @@
           <w:rFonts w:eastAsia="Calibri" w:cs="Calibri"/>
           <w:sz w:val="24"/>
         </w:rPr>
-        <w:t xml:space="preserve">A had been </w:t>
+        <w:t xml:space="preserve">A </w:t>
+      </w:r>
+      <w:r>
+        <w:rPr>
+          <w:rFonts w:eastAsia="Calibri" w:cs="Calibri"/>
+          <w:sz w:val="24"/>
+          <w:highlight w:val="yellow"/>
+        </w:rPr>
+        <w:t>had been</w:t>
+      </w:r>
+      <w:r>
+        <w:rPr>
+          <w:rFonts w:eastAsia="Calibri" w:cs="Calibri"/>
+          <w:sz w:val="24"/>
+        </w:rPr>
+        <w:t xml:space="preserve"> </w:t>
       </w:r>
       <w:r>
         <w:rPr>
@@ -13427,7 +13882,22 @@
           <w:sz w:val="24"/>
         </w:rPr>
         <w:br/>
-        <w:t xml:space="preserve">B are </w:t>
+        <w:t xml:space="preserve">B </w:t>
+      </w:r>
+      <w:r>
+        <w:rPr>
+          <w:rFonts w:eastAsia="Calibri" w:cs="Calibri"/>
+          <w:sz w:val="24"/>
+          <w:highlight w:val="red"/>
+        </w:rPr>
+        <w:t>are</w:t>
+      </w:r>
+      <w:r>
+        <w:rPr>
+          <w:rFonts w:eastAsia="Calibri" w:cs="Calibri"/>
+          <w:sz w:val="24"/>
+        </w:rPr>
+        <w:t xml:space="preserve"> </w:t>
       </w:r>
     </w:p>
     <w:p>
@@ -13729,7 +14199,15 @@
           <w:sz w:val="24"/>
         </w:rPr>
         <w:tab/>
-        <w:t>C available</w:t>
+        <w:t xml:space="preserve">C </w:t>
+      </w:r>
+      <w:r>
+        <w:rPr>
+          <w:rFonts w:eastAsia="Calibri" w:cs="Calibri"/>
+          <w:sz w:val="24"/>
+          <w:highlight w:val="yellow"/>
+        </w:rPr>
+        <w:t>available</w:t>
       </w:r>
       <w:r>
         <w:rPr>
@@ -13832,7 +14310,15 @@
           <w:sz w:val="24"/>
         </w:rPr>
         <w:tab/>
-        <w:t>D ask</w:t>
+        <w:t xml:space="preserve">D </w:t>
+      </w:r>
+      <w:r>
+        <w:rPr>
+          <w:rFonts w:eastAsia="Calibri" w:cs="Calibri"/>
+          <w:sz w:val="24"/>
+          <w:highlight w:val="yellow"/>
+        </w:rPr>
+        <w:t>ask</w:t>
       </w:r>
     </w:p>
     <w:p>
@@ -13876,7 +14362,22 @@
           <w:sz w:val="24"/>
         </w:rPr>
         <w:lastRenderedPageBreak/>
-        <w:t xml:space="preserve">A These may be submitted up to one month in advance of your event. </w:t>
+        <w:t xml:space="preserve">A </w:t>
+      </w:r>
+      <w:r>
+        <w:rPr>
+          <w:rFonts w:eastAsia="Calibri" w:cs="Calibri"/>
+          <w:sz w:val="24"/>
+          <w:highlight w:val="yellow"/>
+        </w:rPr>
+        <w:t>These may be submitted up to one month in advance of your event.</w:t>
+      </w:r>
+      <w:r>
+        <w:rPr>
+          <w:rFonts w:eastAsia="Calibri" w:cs="Calibri"/>
+          <w:sz w:val="24"/>
+        </w:rPr>
+        <w:t xml:space="preserve"> </w:t>
       </w:r>
       <w:r>
         <w:rPr>
@@ -13951,7 +14452,15 @@
           <w:rFonts w:eastAsia="Calibri" w:cs="Calibri"/>
           <w:sz w:val="24"/>
         </w:rPr>
-        <w:t>A use</w:t>
+        <w:t xml:space="preserve">A </w:t>
+      </w:r>
+      <w:r>
+        <w:rPr>
+          <w:rFonts w:eastAsia="Calibri" w:cs="Calibri"/>
+          <w:sz w:val="24"/>
+          <w:highlight w:val="yellow"/>
+        </w:rPr>
+        <w:t>use</w:t>
       </w:r>
       <w:r>
         <w:rPr>
@@ -14477,7 +14986,15 @@
           <w:sz w:val="24"/>
         </w:rPr>
         <w:tab/>
-        <w:t>B pressing</w:t>
+        <w:t xml:space="preserve">B </w:t>
+      </w:r>
+      <w:r>
+        <w:rPr>
+          <w:rFonts w:eastAsia="Calibri" w:cs="Calibri"/>
+          <w:sz w:val="24"/>
+          <w:highlight w:val="yellow"/>
+        </w:rPr>
+        <w:t>pressing</w:t>
       </w:r>
       <w:r>
         <w:rPr>
@@ -14559,7 +15076,15 @@
           <w:rFonts w:eastAsia="Calibri" w:cs="Calibri"/>
           <w:sz w:val="24"/>
         </w:rPr>
-        <w:t xml:space="preserve"> agenda</w:t>
+        <w:t xml:space="preserve"> </w:t>
+      </w:r>
+      <w:r>
+        <w:rPr>
+          <w:rFonts w:eastAsia="Calibri" w:cs="Calibri"/>
+          <w:sz w:val="24"/>
+          <w:highlight w:val="red"/>
+        </w:rPr>
+        <w:t>agenda</w:t>
       </w:r>
       <w:r>
         <w:rPr>
@@ -14589,7 +15114,15 @@
           <w:sz w:val="24"/>
         </w:rPr>
         <w:tab/>
-        <w:t>C period</w:t>
+        <w:t xml:space="preserve">C </w:t>
+      </w:r>
+      <w:r>
+        <w:rPr>
+          <w:rFonts w:eastAsia="Calibri" w:cs="Calibri"/>
+          <w:sz w:val="24"/>
+          <w:highlight w:val="yellow"/>
+        </w:rPr>
+        <w:t>period</w:t>
       </w:r>
       <w:r>
         <w:rPr>
@@ -14692,7 +15225,15 @@
           <w:sz w:val="24"/>
         </w:rPr>
         <w:tab/>
-        <w:t>D unlikely</w:t>
+        <w:t xml:space="preserve">D </w:t>
+      </w:r>
+      <w:r>
+        <w:rPr>
+          <w:rFonts w:eastAsia="Calibri" w:cs="Calibri"/>
+          <w:sz w:val="24"/>
+          <w:highlight w:val="yellow"/>
+        </w:rPr>
+        <w:t>unlikely</w:t>
       </w:r>
     </w:p>
     <w:p>
@@ -14753,23 +15294,46 @@
           <w:sz w:val="24"/>
         </w:rPr>
         <w:br/>
-        <w:t xml:space="preserve">B Our staff meetings are an important opportunity for everyone to discuss business issues together. </w:t>
-      </w:r>
-    </w:p>
-    <w:p>
-      <w:pPr>
-        <w:spacing w:after="0"/>
-        <w:rPr>
-          <w:rFonts w:eastAsia="Calibri" w:cs="Calibri"/>
-          <w:sz w:val="24"/>
-        </w:rPr>
-      </w:pPr>
-      <w:r>
-        <w:rPr>
-          <w:rFonts w:eastAsia="Calibri" w:cs="Calibri"/>
-          <w:sz w:val="24"/>
-        </w:rPr>
-        <w:t>C I regret any inconvenience this may cause and thank you in advance for your cooperation.</w:t>
+        <w:t xml:space="preserve">B </w:t>
+      </w:r>
+      <w:r>
+        <w:rPr>
+          <w:rFonts w:eastAsia="Calibri" w:cs="Calibri"/>
+          <w:sz w:val="24"/>
+          <w:highlight w:val="yellow"/>
+        </w:rPr>
+        <w:t>Our staff meetings are an important opportunity for everyone to discuss business issues together.</w:t>
+      </w:r>
+      <w:r>
+        <w:rPr>
+          <w:rFonts w:eastAsia="Calibri" w:cs="Calibri"/>
+          <w:sz w:val="24"/>
+        </w:rPr>
+        <w:t xml:space="preserve"> </w:t>
+      </w:r>
+    </w:p>
+    <w:p>
+      <w:pPr>
+        <w:spacing w:after="0"/>
+        <w:rPr>
+          <w:rFonts w:eastAsia="Calibri" w:cs="Calibri"/>
+          <w:sz w:val="24"/>
+        </w:rPr>
+      </w:pPr>
+      <w:r>
+        <w:rPr>
+          <w:rFonts w:eastAsia="Calibri" w:cs="Calibri"/>
+          <w:sz w:val="24"/>
+        </w:rPr>
+        <w:t xml:space="preserve">C </w:t>
+      </w:r>
+      <w:r>
+        <w:rPr>
+          <w:rFonts w:eastAsia="Calibri" w:cs="Calibri"/>
+          <w:sz w:val="24"/>
+          <w:highlight w:val="red"/>
+        </w:rPr>
+        <w:t>I regret any inconvenience this may cause and thank you in advance for your cooperation.</w:t>
       </w:r>
     </w:p>
     <w:p>
@@ -14976,7 +15540,15 @@
           <w:rFonts w:eastAsia="Calibri" w:cs="Calibri"/>
           <w:sz w:val="24"/>
         </w:rPr>
-        <w:t xml:space="preserve"> in</w:t>
+        <w:t xml:space="preserve"> </w:t>
+      </w:r>
+      <w:r>
+        <w:rPr>
+          <w:rFonts w:eastAsia="Calibri" w:cs="Calibri"/>
+          <w:sz w:val="24"/>
+          <w:highlight w:val="yellow"/>
+        </w:rPr>
+        <w:t>in</w:t>
       </w:r>
       <w:r>
         <w:rPr>
@@ -15050,7 +15622,15 @@
           <w:sz w:val="24"/>
         </w:rPr>
         <w:tab/>
-        <w:t>D of</w:t>
+        <w:t xml:space="preserve">D </w:t>
+      </w:r>
+      <w:r>
+        <w:rPr>
+          <w:rFonts w:eastAsia="Calibri" w:cs="Calibri"/>
+          <w:sz w:val="24"/>
+          <w:highlight w:val="red"/>
+        </w:rPr>
+        <w:t>of</w:t>
       </w:r>
     </w:p>
     <w:p>
@@ -15168,7 +15748,15 @@
           <w:sz w:val="24"/>
         </w:rPr>
         <w:tab/>
-        <w:t>D their</w:t>
+        <w:t xml:space="preserve">D </w:t>
+      </w:r>
+      <w:r>
+        <w:rPr>
+          <w:rFonts w:eastAsia="Calibri" w:cs="Calibri"/>
+          <w:sz w:val="24"/>
+          <w:highlight w:val="yellow"/>
+        </w:rPr>
+        <w:t>their</w:t>
       </w:r>
     </w:p>
     <w:p>
@@ -15241,7 +15829,15 @@
           <w:sz w:val="24"/>
         </w:rPr>
         <w:tab/>
-        <w:t>C expanding</w:t>
+        <w:t xml:space="preserve">C </w:t>
+      </w:r>
+      <w:r>
+        <w:rPr>
+          <w:rFonts w:eastAsia="Calibri" w:cs="Calibri"/>
+          <w:sz w:val="24"/>
+          <w:highlight w:val="yellow"/>
+        </w:rPr>
+        <w:t>expanding</w:t>
       </w:r>
       <w:r>
         <w:rPr>
@@ -15307,7 +15903,22 @@
           <w:sz w:val="24"/>
         </w:rPr>
         <w:br/>
-        <w:t xml:space="preserve">B Contact us today for a free appointment to discuss your gardening needs.  </w:t>
+        <w:t xml:space="preserve">B </w:t>
+      </w:r>
+      <w:r>
+        <w:rPr>
+          <w:rFonts w:eastAsia="Calibri" w:cs="Calibri"/>
+          <w:sz w:val="24"/>
+          <w:highlight w:val="red"/>
+        </w:rPr>
+        <w:t>Contact us today for a free appointment to discuss your gardening needs.</w:t>
+      </w:r>
+      <w:r>
+        <w:rPr>
+          <w:rFonts w:eastAsia="Calibri" w:cs="Calibri"/>
+          <w:sz w:val="24"/>
+        </w:rPr>
+        <w:t xml:space="preserve">  </w:t>
       </w:r>
     </w:p>
     <w:p>
@@ -15339,7 +15950,22 @@
           <w:rFonts w:eastAsia="Calibri" w:cs="Calibri"/>
           <w:sz w:val="24"/>
         </w:rPr>
-        <w:t xml:space="preserve">D We enjoy looking at our garden and believe it has really beautified the neighborhood. </w:t>
+        <w:t xml:space="preserve">D </w:t>
+      </w:r>
+      <w:r>
+        <w:rPr>
+          <w:rFonts w:eastAsia="Calibri" w:cs="Calibri"/>
+          <w:sz w:val="24"/>
+          <w:highlight w:val="yellow"/>
+        </w:rPr>
+        <w:t>We enjoy looking at our garden and believe it has really beautified the neighborhood</w:t>
+      </w:r>
+      <w:r>
+        <w:rPr>
+          <w:rFonts w:eastAsia="Calibri" w:cs="Calibri"/>
+          <w:sz w:val="24"/>
+        </w:rPr>
+        <w:t xml:space="preserve">. </w:t>
       </w:r>
     </w:p>
     <w:p>
@@ -15490,7 +16116,22 @@
           <w:rFonts w:eastAsia="Calibri" w:cs="Calibri"/>
           <w:sz w:val="24"/>
         </w:rPr>
-        <w:t>C Just follow these steps to brew perfect coffee every time.</w:t>
+        <w:t xml:space="preserve">C </w:t>
+      </w:r>
+      <w:r>
+        <w:rPr>
+          <w:rFonts w:eastAsia="Calibri" w:cs="Calibri"/>
+          <w:sz w:val="24"/>
+          <w:highlight w:val="yellow"/>
+        </w:rPr>
+        <w:t>Just follow these steps to brew perfect coffee every time</w:t>
+      </w:r>
+      <w:r>
+        <w:rPr>
+          <w:rFonts w:eastAsia="Calibri" w:cs="Calibri"/>
+          <w:sz w:val="24"/>
+        </w:rPr>
+        <w:t>.</w:t>
       </w:r>
     </w:p>
     <w:p>
@@ -15601,7 +16242,15 @@
           <w:sz w:val="24"/>
         </w:rPr>
         <w:tab/>
-        <w:t>D while</w:t>
+        <w:t xml:space="preserve">D </w:t>
+      </w:r>
+      <w:r>
+        <w:rPr>
+          <w:rFonts w:eastAsia="Calibri" w:cs="Calibri"/>
+          <w:sz w:val="24"/>
+          <w:highlight w:val="yellow"/>
+        </w:rPr>
+        <w:t>while</w:t>
       </w:r>
     </w:p>
     <w:p>
@@ -15696,7 +16345,15 @@
           <w:sz w:val="24"/>
         </w:rPr>
         <w:tab/>
-        <w:t>D size</w:t>
+        <w:t xml:space="preserve">D </w:t>
+      </w:r>
+      <w:r>
+        <w:rPr>
+          <w:rFonts w:eastAsia="Calibri" w:cs="Calibri"/>
+          <w:sz w:val="24"/>
+          <w:highlight w:val="yellow"/>
+        </w:rPr>
+        <w:t>size</w:t>
       </w:r>
     </w:p>
     <w:p>
@@ -15739,29 +16396,45 @@
           <w:rFonts w:eastAsia="Calibri" w:cs="Calibri"/>
           <w:sz w:val="24"/>
         </w:rPr>
-        <w:t>A do</w:t>
-      </w:r>
-      <w:r>
-        <w:rPr>
-          <w:rFonts w:eastAsia="Calibri" w:cs="Calibri"/>
-          <w:sz w:val="24"/>
-        </w:rPr>
-        <w:tab/>
-      </w:r>
-      <w:r>
-        <w:rPr>
-          <w:rFonts w:eastAsia="Calibri" w:cs="Calibri"/>
-          <w:sz w:val="24"/>
-        </w:rPr>
-        <w:tab/>
-      </w:r>
-      <w:r>
-        <w:rPr>
-          <w:rFonts w:eastAsia="Calibri" w:cs="Calibri"/>
-          <w:sz w:val="24"/>
-        </w:rPr>
-        <w:tab/>
-        <w:t>B does</w:t>
+        <w:t xml:space="preserve">A </w:t>
+      </w:r>
+      <w:r>
+        <w:rPr>
+          <w:rFonts w:eastAsia="Calibri" w:cs="Calibri"/>
+          <w:sz w:val="24"/>
+          <w:highlight w:val="red"/>
+        </w:rPr>
+        <w:t>do</w:t>
+      </w:r>
+      <w:r>
+        <w:rPr>
+          <w:rFonts w:eastAsia="Calibri" w:cs="Calibri"/>
+          <w:sz w:val="24"/>
+        </w:rPr>
+        <w:tab/>
+      </w:r>
+      <w:r>
+        <w:rPr>
+          <w:rFonts w:eastAsia="Calibri" w:cs="Calibri"/>
+          <w:sz w:val="24"/>
+        </w:rPr>
+        <w:tab/>
+      </w:r>
+      <w:r>
+        <w:rPr>
+          <w:rFonts w:eastAsia="Calibri" w:cs="Calibri"/>
+          <w:sz w:val="24"/>
+        </w:rPr>
+        <w:tab/>
+        <w:t xml:space="preserve">B </w:t>
+      </w:r>
+      <w:r>
+        <w:rPr>
+          <w:rFonts w:eastAsia="Calibri" w:cs="Calibri"/>
+          <w:sz w:val="24"/>
+          <w:highlight w:val="yellow"/>
+        </w:rPr>
+        <w:t>does</w:t>
       </w:r>
       <w:r>
         <w:rPr>
@@ -16047,7 +16720,15 @@
           <w:sz w:val="24"/>
         </w:rPr>
         <w:tab/>
-        <w:t>B in some coach cars</w:t>
+        <w:t xml:space="preserve">B </w:t>
+      </w:r>
+      <w:r>
+        <w:rPr>
+          <w:rFonts w:eastAsia="Calibri" w:cs="Calibri"/>
+          <w:sz w:val="24"/>
+          <w:highlight w:val="yellow"/>
+        </w:rPr>
+        <w:t>in some coach cars</w:t>
       </w:r>
       <w:r>
         <w:rPr>
@@ -16187,7 +16868,22 @@
           <w:rFonts w:eastAsia="Calibri" w:cs="Calibri"/>
           <w:sz w:val="24"/>
         </w:rPr>
-        <w:t xml:space="preserve">C when reservations aren’t canceled </w:t>
+        <w:t xml:space="preserve">C </w:t>
+      </w:r>
+      <w:r>
+        <w:rPr>
+          <w:rFonts w:eastAsia="Calibri" w:cs="Calibri"/>
+          <w:sz w:val="24"/>
+          <w:highlight w:val="yellow"/>
+        </w:rPr>
+        <w:t>when reservations aren’t canceled</w:t>
+      </w:r>
+      <w:r>
+        <w:rPr>
+          <w:rFonts w:eastAsia="Calibri" w:cs="Calibri"/>
+          <w:sz w:val="24"/>
+        </w:rPr>
+        <w:t xml:space="preserve"> </w:t>
       </w:r>
       <w:r>
         <w:rPr>
@@ -17139,7 +17835,15 @@
           <w:sz w:val="24"/>
         </w:rPr>
         <w:tab/>
-        <w:t>D he understands which bus to take</w:t>
+        <w:t xml:space="preserve">D </w:t>
+      </w:r>
+      <w:r>
+        <w:rPr>
+          <w:rFonts w:eastAsia="Calibri" w:cs="Calibri"/>
+          <w:sz w:val="24"/>
+          <w:highlight w:val="yellow"/>
+        </w:rPr>
+        <w:t>he understands which bus to take</w:t>
       </w:r>
     </w:p>
     <w:p>
@@ -17177,36 +17881,52 @@
           <w:sz w:val="24"/>
         </w:rPr>
       </w:pPr>
-      <w:bookmarkStart w:id="1" w:name="_heading=h.gjdgxs" w:colFirst="0" w:colLast="0"/>
-      <w:bookmarkEnd w:id="1"/>
-      <w:r>
-        <w:rPr>
-          <w:rFonts w:eastAsia="Calibri" w:cs="Calibri"/>
-          <w:sz w:val="24"/>
-        </w:rPr>
-        <w:t>A he’s Ms. Lopez’s boss</w:t>
-      </w:r>
-      <w:r>
-        <w:rPr>
-          <w:rFonts w:eastAsia="Calibri" w:cs="Calibri"/>
-          <w:sz w:val="24"/>
-        </w:rPr>
-        <w:tab/>
-      </w:r>
-      <w:r>
-        <w:rPr>
-          <w:rFonts w:eastAsia="Calibri" w:cs="Calibri"/>
-          <w:sz w:val="24"/>
-        </w:rPr>
-        <w:tab/>
-      </w:r>
-      <w:r>
-        <w:rPr>
-          <w:rFonts w:eastAsia="Calibri" w:cs="Calibri"/>
-          <w:sz w:val="24"/>
-        </w:rPr>
-        <w:tab/>
-        <w:t>B he has never been to Ms. Lopez’s before</w:t>
+      <w:bookmarkStart w:id="0" w:name="_heading=h.gjdgxs" w:colFirst="0" w:colLast="0"/>
+      <w:bookmarkEnd w:id="0"/>
+      <w:r>
+        <w:rPr>
+          <w:rFonts w:eastAsia="Calibri" w:cs="Calibri"/>
+          <w:sz w:val="24"/>
+        </w:rPr>
+        <w:t xml:space="preserve">A </w:t>
+      </w:r>
+      <w:r>
+        <w:rPr>
+          <w:rFonts w:eastAsia="Calibri" w:cs="Calibri"/>
+          <w:sz w:val="24"/>
+          <w:highlight w:val="yellow"/>
+        </w:rPr>
+        <w:t>he’s Ms. Lopez’s boss</w:t>
+      </w:r>
+      <w:r>
+        <w:rPr>
+          <w:rFonts w:eastAsia="Calibri" w:cs="Calibri"/>
+          <w:sz w:val="24"/>
+        </w:rPr>
+        <w:tab/>
+      </w:r>
+      <w:r>
+        <w:rPr>
+          <w:rFonts w:eastAsia="Calibri" w:cs="Calibri"/>
+          <w:sz w:val="24"/>
+        </w:rPr>
+        <w:tab/>
+      </w:r>
+      <w:r>
+        <w:rPr>
+          <w:rFonts w:eastAsia="Calibri" w:cs="Calibri"/>
+          <w:sz w:val="24"/>
+        </w:rPr>
+        <w:tab/>
+        <w:t xml:space="preserve">B </w:t>
+      </w:r>
+      <w:r>
+        <w:rPr>
+          <w:rFonts w:eastAsia="Calibri" w:cs="Calibri"/>
+          <w:sz w:val="24"/>
+          <w:highlight w:val="red"/>
+        </w:rPr>
+        <w:t>he has never been to Ms. Lopez’s before</w:t>
       </w:r>
     </w:p>
     <w:p>
@@ -17330,13 +18050,22 @@
           <w:rFonts w:eastAsia="Calibri" w:cs="Calibri"/>
           <w:sz w:val="24"/>
         </w:rPr>
-        <w:t>A an</w:t>
+        <w:t xml:space="preserve">A </w:t>
+      </w:r>
+      <w:r>
+        <w:rPr>
+          <w:rFonts w:eastAsia="Calibri" w:cs="Calibri"/>
+          <w:sz w:val="24"/>
+          <w:highlight w:val="yellow"/>
+        </w:rPr>
+        <w:t>an</w:t>
       </w:r>
       <w:proofErr w:type="gramEnd"/>
       <w:r>
         <w:rPr>
           <w:rFonts w:eastAsia="Calibri" w:cs="Calibri"/>
           <w:sz w:val="24"/>
+          <w:highlight w:val="yellow"/>
         </w:rPr>
         <w:t xml:space="preserve"> office</w:t>
       </w:r>
@@ -17441,7 +18170,15 @@
           <w:sz w:val="24"/>
         </w:rPr>
         <w:tab/>
-        <w:t>B a parking space</w:t>
+        <w:t xml:space="preserve">B </w:t>
+      </w:r>
+      <w:r>
+        <w:rPr>
+          <w:rFonts w:eastAsia="Calibri" w:cs="Calibri"/>
+          <w:sz w:val="24"/>
+          <w:highlight w:val="yellow"/>
+        </w:rPr>
+        <w:t>a parking space</w:t>
       </w:r>
       <w:r>
         <w:rPr>
@@ -17457,7 +18194,15 @@
           <w:sz w:val="24"/>
         </w:rPr>
         <w:tab/>
-        <w:t>D electricity</w:t>
+        <w:t xml:space="preserve">D </w:t>
+      </w:r>
+      <w:r>
+        <w:rPr>
+          <w:rFonts w:eastAsia="Calibri" w:cs="Calibri"/>
+          <w:sz w:val="24"/>
+          <w:highlight w:val="red"/>
+        </w:rPr>
+        <w:t>electricity</w:t>
       </w:r>
     </w:p>
     <w:p>
@@ -17826,7 +18571,15 @@
           <w:sz w:val="24"/>
         </w:rPr>
         <w:tab/>
-        <w:t>B museum</w:t>
+        <w:t xml:space="preserve">B </w:t>
+      </w:r>
+      <w:r>
+        <w:rPr>
+          <w:rFonts w:eastAsia="Calibri" w:cs="Calibri"/>
+          <w:sz w:val="24"/>
+          <w:highlight w:val="yellow"/>
+        </w:rPr>
+        <w:t>museum</w:t>
       </w:r>
       <w:r>
         <w:rPr>
@@ -17909,11 +18662,20 @@
           <w:rFonts w:eastAsia="Calibri" w:cs="Calibri"/>
           <w:sz w:val="24"/>
         </w:rPr>
-        <w:t xml:space="preserve"> it can be used twice</w:t>
-      </w:r>
-      <w:r>
-        <w:rPr>
-          <w:rFonts w:eastAsia="Calibri" w:cs="Calibri"/>
+        <w:t xml:space="preserve"> </w:t>
+      </w:r>
+      <w:r>
+        <w:rPr>
+          <w:rFonts w:eastAsia="Calibri" w:cs="Calibri"/>
+          <w:color w:val="FF0000"/>
+          <w:sz w:val="24"/>
+        </w:rPr>
+        <w:t>it can be used twice</w:t>
+      </w:r>
+      <w:r>
+        <w:rPr>
+          <w:rFonts w:eastAsia="Calibri" w:cs="Calibri"/>
+          <w:color w:val="FF0000"/>
           <w:sz w:val="24"/>
         </w:rPr>
         <w:tab/>
@@ -17969,7 +18731,15 @@
           <w:sz w:val="24"/>
         </w:rPr>
         <w:tab/>
-        <w:t>D it must be bought ahead of time</w:t>
+        <w:t xml:space="preserve">D </w:t>
+      </w:r>
+      <w:r>
+        <w:rPr>
+          <w:rFonts w:eastAsia="Calibri" w:cs="Calibri"/>
+          <w:sz w:val="24"/>
+          <w:highlight w:val="yellow"/>
+        </w:rPr>
+        <w:t>it must be bought ahead of time</w:t>
       </w:r>
     </w:p>
     <w:p>
@@ -18172,7 +18942,15 @@
           <w:sz w:val="24"/>
         </w:rPr>
         <w:tab/>
-        <w:t>B a new factory</w:t>
+        <w:t xml:space="preserve">B </w:t>
+      </w:r>
+      <w:r>
+        <w:rPr>
+          <w:rFonts w:eastAsia="Calibri" w:cs="Calibri"/>
+          <w:sz w:val="24"/>
+          <w:highlight w:val="yellow"/>
+        </w:rPr>
+        <w:t>a new factory</w:t>
       </w:r>
       <w:r>
         <w:rPr>
@@ -18276,6 +19054,7 @@
         <w:rPr>
           <w:rFonts w:eastAsia="Calibri" w:cs="Calibri"/>
           <w:sz w:val="24"/>
+          <w:highlight w:val="red"/>
         </w:rPr>
         <w:t>a</w:t>
       </w:r>
@@ -18284,6 +19063,7 @@
         <w:rPr>
           <w:rFonts w:eastAsia="Calibri" w:cs="Calibri"/>
           <w:sz w:val="24"/>
+          <w:highlight w:val="red"/>
         </w:rPr>
         <w:t xml:space="preserve"> factory will open</w:t>
       </w:r>
@@ -18330,7 +19110,22 @@
           <w:rFonts w:eastAsia="Calibri" w:cs="Calibri"/>
           <w:sz w:val="24"/>
         </w:rPr>
-        <w:t xml:space="preserve">C protests will be organized </w:t>
+        <w:t xml:space="preserve">C </w:t>
+      </w:r>
+      <w:r>
+        <w:rPr>
+          <w:rFonts w:eastAsia="Calibri" w:cs="Calibri"/>
+          <w:sz w:val="24"/>
+          <w:highlight w:val="yellow"/>
+        </w:rPr>
+        <w:t>protests will be organized</w:t>
+      </w:r>
+      <w:r>
+        <w:rPr>
+          <w:rFonts w:eastAsia="Calibri" w:cs="Calibri"/>
+          <w:sz w:val="24"/>
+        </w:rPr>
+        <w:t xml:space="preserve"> </w:t>
       </w:r>
       <w:r>
         <w:rPr>
@@ -18449,7 +19244,22 @@
           <w:rFonts w:eastAsia="Calibri" w:cs="Calibri"/>
           <w:sz w:val="24"/>
         </w:rPr>
-        <w:t xml:space="preserve">C harm to the local environment </w:t>
+        <w:t xml:space="preserve">C </w:t>
+      </w:r>
+      <w:r>
+        <w:rPr>
+          <w:rFonts w:eastAsia="Calibri" w:cs="Calibri"/>
+          <w:sz w:val="24"/>
+          <w:highlight w:val="yellow"/>
+        </w:rPr>
+        <w:t>harm to the local environment</w:t>
+      </w:r>
+      <w:r>
+        <w:rPr>
+          <w:rFonts w:eastAsia="Calibri" w:cs="Calibri"/>
+          <w:sz w:val="24"/>
+        </w:rPr>
+        <w:t xml:space="preserve"> </w:t>
       </w:r>
       <w:r>
         <w:rPr>
@@ -18926,7 +19736,15 @@
           <w:rFonts w:eastAsia="Calibri" w:cs="Calibri"/>
           <w:sz w:val="24"/>
         </w:rPr>
-        <w:t>C the sweater s not available anymore</w:t>
+        <w:t xml:space="preserve">C </w:t>
+      </w:r>
+      <w:r>
+        <w:rPr>
+          <w:rFonts w:eastAsia="Calibri" w:cs="Calibri"/>
+          <w:sz w:val="24"/>
+          <w:highlight w:val="yellow"/>
+        </w:rPr>
+        <w:t>the sweater s not available anymore</w:t>
       </w:r>
       <w:r>
         <w:rPr>
@@ -18999,7 +19817,15 @@
           <w:rFonts w:eastAsia="Calibri" w:cs="Calibri"/>
           <w:sz w:val="24"/>
         </w:rPr>
-        <w:t>A place a new order</w:t>
+        <w:t xml:space="preserve">A </w:t>
+      </w:r>
+      <w:r>
+        <w:rPr>
+          <w:rFonts w:eastAsia="Calibri" w:cs="Calibri"/>
+          <w:sz w:val="24"/>
+          <w:highlight w:val="yellow"/>
+        </w:rPr>
+        <w:t>place a new order</w:t>
       </w:r>
       <w:r>
         <w:rPr>
@@ -19164,29 +19990,45 @@
           <w:sz w:val="24"/>
         </w:rPr>
         <w:tab/>
-        <w:t>B [2]</w:t>
-      </w:r>
-      <w:r>
-        <w:rPr>
-          <w:rFonts w:eastAsia="Calibri" w:cs="Calibri"/>
-          <w:sz w:val="24"/>
-        </w:rPr>
-        <w:tab/>
-      </w:r>
-      <w:r>
-        <w:rPr>
-          <w:rFonts w:eastAsia="Calibri" w:cs="Calibri"/>
-          <w:sz w:val="24"/>
-        </w:rPr>
-        <w:tab/>
-      </w:r>
-      <w:r>
-        <w:rPr>
-          <w:rFonts w:eastAsia="Calibri" w:cs="Calibri"/>
-          <w:sz w:val="24"/>
-        </w:rPr>
-        <w:tab/>
-        <w:t>C [3]</w:t>
+        <w:t xml:space="preserve">B </w:t>
+      </w:r>
+      <w:r>
+        <w:rPr>
+          <w:rFonts w:eastAsia="Calibri" w:cs="Calibri"/>
+          <w:sz w:val="24"/>
+          <w:highlight w:val="red"/>
+        </w:rPr>
+        <w:t>[2]</w:t>
+      </w:r>
+      <w:r>
+        <w:rPr>
+          <w:rFonts w:eastAsia="Calibri" w:cs="Calibri"/>
+          <w:sz w:val="24"/>
+        </w:rPr>
+        <w:tab/>
+      </w:r>
+      <w:r>
+        <w:rPr>
+          <w:rFonts w:eastAsia="Calibri" w:cs="Calibri"/>
+          <w:sz w:val="24"/>
+        </w:rPr>
+        <w:tab/>
+      </w:r>
+      <w:r>
+        <w:rPr>
+          <w:rFonts w:eastAsia="Calibri" w:cs="Calibri"/>
+          <w:sz w:val="24"/>
+        </w:rPr>
+        <w:tab/>
+        <w:t xml:space="preserve">C </w:t>
+      </w:r>
+      <w:r>
+        <w:rPr>
+          <w:rFonts w:eastAsia="Calibri" w:cs="Calibri"/>
+          <w:sz w:val="24"/>
+          <w:highlight w:val="yellow"/>
+        </w:rPr>
+        <w:t>[3]</w:t>
       </w:r>
       <w:r>
         <w:rPr>
@@ -19594,7 +20436,15 @@
           <w:sz w:val="24"/>
         </w:rPr>
         <w:tab/>
-        <w:t>B $35</w:t>
+        <w:t xml:space="preserve">B </w:t>
+      </w:r>
+      <w:r>
+        <w:rPr>
+          <w:rFonts w:eastAsia="Calibri" w:cs="Calibri"/>
+          <w:sz w:val="24"/>
+          <w:highlight w:val="yellow"/>
+        </w:rPr>
+        <w:t>$35</w:t>
       </w:r>
       <w:r>
         <w:rPr>
@@ -19668,7 +20518,15 @@
           <w:sz w:val="24"/>
         </w:rPr>
         <w:lastRenderedPageBreak/>
-        <w:t>A that the company buys the kit</w:t>
+        <w:t xml:space="preserve">A </w:t>
+      </w:r>
+      <w:r>
+        <w:rPr>
+          <w:rFonts w:eastAsia="Calibri" w:cs="Calibri"/>
+          <w:sz w:val="24"/>
+          <w:highlight w:val="red"/>
+        </w:rPr>
+        <w:t>that the company buys the kit</w:t>
       </w:r>
       <w:r>
         <w:rPr>
@@ -19724,7 +20582,22 @@
           <w:sz w:val="24"/>
         </w:rPr>
         <w:tab/>
-        <w:t xml:space="preserve">D that managers and supervisors hold more frequent meetings </w:t>
+        <w:t xml:space="preserve">D </w:t>
+      </w:r>
+      <w:r>
+        <w:rPr>
+          <w:rFonts w:eastAsia="Calibri" w:cs="Calibri"/>
+          <w:sz w:val="24"/>
+          <w:highlight w:val="yellow"/>
+        </w:rPr>
+        <w:t>that managers and supervisors hold more frequent meetings</w:t>
+      </w:r>
+      <w:r>
+        <w:rPr>
+          <w:rFonts w:eastAsia="Calibri" w:cs="Calibri"/>
+          <w:sz w:val="24"/>
+        </w:rPr>
+        <w:t xml:space="preserve"> </w:t>
       </w:r>
     </w:p>
     <w:p>
@@ -19845,7 +20718,15 @@
           <w:rFonts w:eastAsia="Calibri" w:cs="Calibri"/>
           <w:sz w:val="24"/>
         </w:rPr>
-        <w:t>C information about the seminar</w:t>
+        <w:t xml:space="preserve">C </w:t>
+      </w:r>
+      <w:r>
+        <w:rPr>
+          <w:rFonts w:eastAsia="Calibri" w:cs="Calibri"/>
+          <w:sz w:val="24"/>
+          <w:highlight w:val="yellow"/>
+        </w:rPr>
+        <w:t>information about the seminar</w:t>
       </w:r>
       <w:r>
         <w:rPr>
@@ -20437,7 +21318,15 @@
           <w:rFonts w:eastAsia="Calibri" w:cs="Calibri"/>
           <w:sz w:val="24"/>
         </w:rPr>
-        <w:t>C to provide a reference</w:t>
+        <w:t xml:space="preserve">C </w:t>
+      </w:r>
+      <w:r>
+        <w:rPr>
+          <w:rFonts w:eastAsia="Calibri" w:cs="Calibri"/>
+          <w:sz w:val="24"/>
+          <w:highlight w:val="yellow"/>
+        </w:rPr>
+        <w:t>to provide a reference</w:t>
       </w:r>
       <w:r>
         <w:rPr>
@@ -20524,7 +21413,15 @@
           <w:rFonts w:eastAsia="Calibri" w:cs="Calibri"/>
           <w:sz w:val="24"/>
         </w:rPr>
-        <w:t>C he is qualified to be a manager</w:t>
+        <w:t xml:space="preserve">C </w:t>
+      </w:r>
+      <w:r>
+        <w:rPr>
+          <w:rFonts w:eastAsia="Calibri" w:cs="Calibri"/>
+          <w:sz w:val="24"/>
+          <w:highlight w:val="yellow"/>
+        </w:rPr>
+        <w:t>he is qualified to be a manager</w:t>
       </w:r>
       <w:r>
         <w:rPr>
@@ -20597,7 +21494,22 @@
           <w:sz w:val="24"/>
         </w:rPr>
         <w:tab/>
-        <w:t xml:space="preserve">D athletic equipment </w:t>
+        <w:t xml:space="preserve">D </w:t>
+      </w:r>
+      <w:r>
+        <w:rPr>
+          <w:rFonts w:eastAsia="Calibri" w:cs="Calibri"/>
+          <w:sz w:val="24"/>
+          <w:highlight w:val="yellow"/>
+        </w:rPr>
+        <w:t>athletic equipment</w:t>
+      </w:r>
+      <w:r>
+        <w:rPr>
+          <w:rFonts w:eastAsia="Calibri" w:cs="Calibri"/>
+          <w:sz w:val="24"/>
+        </w:rPr>
+        <w:t xml:space="preserve"> </w:t>
       </w:r>
     </w:p>
     <w:p>
@@ -20640,7 +21552,22 @@
           <w:rFonts w:eastAsia="Calibri" w:cs="Calibri"/>
           <w:sz w:val="24"/>
         </w:rPr>
-        <w:t xml:space="preserve">A Santa Fe, New Mexico </w:t>
+        <w:t xml:space="preserve">A </w:t>
+      </w:r>
+      <w:r>
+        <w:rPr>
+          <w:rFonts w:eastAsia="Calibri" w:cs="Calibri"/>
+          <w:sz w:val="24"/>
+          <w:highlight w:val="yellow"/>
+        </w:rPr>
+        <w:t>Santa Fe, New Mexico</w:t>
+      </w:r>
+      <w:r>
+        <w:rPr>
+          <w:rFonts w:eastAsia="Calibri" w:cs="Calibri"/>
+          <w:sz w:val="24"/>
+        </w:rPr>
+        <w:t xml:space="preserve"> </w:t>
       </w:r>
       <w:r>
         <w:rPr>
@@ -21292,7 +22219,6 @@
         <w:rPr>
           <w:rFonts w:eastAsia="Calibri" w:cs="Calibri"/>
         </w:rPr>
-        <w:lastRenderedPageBreak/>
         <w:t xml:space="preserve">I’m copying and pasting this from the memo. Give me a minute. </w:t>
       </w:r>
     </w:p>
@@ -21399,6 +22325,7 @@
         <w:rPr>
           <w:rFonts w:eastAsia="Calibri" w:cs="Calibri"/>
         </w:rPr>
+        <w:lastRenderedPageBreak/>
         <w:t xml:space="preserve">First you can receive a discount on membership at Siler Wave Gym by presenting your employee ID card. Here are several levels of membership available. Whichever level you chose you are entitled a 25% off the normal fee. </w:t>
       </w:r>
     </w:p>
@@ -22228,6 +23155,7 @@
         <w:rPr>
           <w:rFonts w:eastAsia="Calibri" w:cs="Calibri"/>
           <w:sz w:val="24"/>
+          <w:highlight w:val="yellow"/>
         </w:rPr>
         <w:t>a</w:t>
       </w:r>
@@ -22236,6 +23164,7 @@
         <w:rPr>
           <w:rFonts w:eastAsia="Calibri" w:cs="Calibri"/>
           <w:sz w:val="24"/>
+          <w:highlight w:val="yellow"/>
         </w:rPr>
         <w:t xml:space="preserve"> recent staff </w:t>
       </w:r>
@@ -22244,8 +23173,16 @@
         <w:rPr>
           <w:rFonts w:eastAsia="Calibri" w:cs="Calibri"/>
           <w:sz w:val="24"/>
-        </w:rPr>
-        <w:t xml:space="preserve">meeting  </w:t>
+          <w:highlight w:val="yellow"/>
+        </w:rPr>
+        <w:t>meeting</w:t>
+      </w:r>
+      <w:r>
+        <w:rPr>
+          <w:rFonts w:eastAsia="Calibri" w:cs="Calibri"/>
+          <w:sz w:val="24"/>
+        </w:rPr>
+        <w:t xml:space="preserve">  </w:t>
       </w:r>
       <w:r>
         <w:rPr>
@@ -22268,7 +23205,22 @@
           <w:sz w:val="24"/>
         </w:rPr>
         <w:tab/>
-        <w:t xml:space="preserve">B upcoming company events </w:t>
+        <w:t xml:space="preserve">B </w:t>
+      </w:r>
+      <w:r>
+        <w:rPr>
+          <w:rFonts w:eastAsia="Calibri" w:cs="Calibri"/>
+          <w:sz w:val="24"/>
+          <w:highlight w:val="red"/>
+        </w:rPr>
+        <w:t>upcoming company events</w:t>
+      </w:r>
+      <w:r>
+        <w:rPr>
+          <w:rFonts w:eastAsia="Calibri" w:cs="Calibri"/>
+          <w:sz w:val="24"/>
+        </w:rPr>
+        <w:t xml:space="preserve"> </w:t>
       </w:r>
     </w:p>
     <w:p>
@@ -22364,7 +23316,15 @@
           <w:rFonts w:eastAsia="Calibri" w:cs="Calibri"/>
           <w:sz w:val="24"/>
         </w:rPr>
-        <w:t>C she supports Jim’s ideas</w:t>
+        <w:t xml:space="preserve">C </w:t>
+      </w:r>
+      <w:r>
+        <w:rPr>
+          <w:rFonts w:eastAsia="Calibri" w:cs="Calibri"/>
+          <w:sz w:val="24"/>
+          <w:highlight w:val="yellow"/>
+        </w:rPr>
+        <w:t>she supports Jim’s ideas</w:t>
       </w:r>
       <w:r>
         <w:rPr>
@@ -22491,15 +23451,31 @@
           <w:rFonts w:eastAsia="Calibri" w:cs="Calibri"/>
           <w:sz w:val="24"/>
         </w:rPr>
-        <w:t>C an</w:t>
+        <w:t xml:space="preserve">C </w:t>
+      </w:r>
+      <w:r>
+        <w:rPr>
+          <w:rFonts w:eastAsia="Calibri" w:cs="Calibri"/>
+          <w:sz w:val="24"/>
+          <w:highlight w:val="yellow"/>
+        </w:rPr>
+        <w:t>an</w:t>
       </w:r>
       <w:proofErr w:type="spellEnd"/>
       <w:r>
         <w:rPr>
           <w:rFonts w:eastAsia="Calibri" w:cs="Calibri"/>
           <w:sz w:val="24"/>
-        </w:rPr>
-        <w:t xml:space="preserve"> exercise expert </w:t>
+          <w:highlight w:val="yellow"/>
+        </w:rPr>
+        <w:t xml:space="preserve"> exercise expert</w:t>
+      </w:r>
+      <w:r>
+        <w:rPr>
+          <w:rFonts w:eastAsia="Calibri" w:cs="Calibri"/>
+          <w:sz w:val="24"/>
+        </w:rPr>
+        <w:t xml:space="preserve"> </w:t>
       </w:r>
       <w:r>
         <w:rPr>
@@ -22580,7 +23556,15 @@
           <w:rFonts w:eastAsia="Calibri" w:cs="Calibri"/>
           <w:sz w:val="24"/>
         </w:rPr>
-        <w:t>A she thinks it will not be popular</w:t>
+        <w:t xml:space="preserve">A </w:t>
+      </w:r>
+      <w:r>
+        <w:rPr>
+          <w:rFonts w:eastAsia="Calibri" w:cs="Calibri"/>
+          <w:sz w:val="24"/>
+          <w:highlight w:val="yellow"/>
+        </w:rPr>
+        <w:t>she thinks it will not be popular</w:t>
       </w:r>
       <w:r>
         <w:rPr>
@@ -22618,39 +23602,39 @@
           <w:rFonts w:eastAsia="Calibri" w:cs="Calibri"/>
           <w:sz w:val="24"/>
         </w:rPr>
+        <w:t xml:space="preserve">C she hopes the manager will participate </w:t>
+      </w:r>
+      <w:r>
+        <w:rPr>
+          <w:rFonts w:eastAsia="Calibri" w:cs="Calibri"/>
+          <w:sz w:val="24"/>
+        </w:rPr>
+        <w:tab/>
+      </w:r>
+      <w:r>
+        <w:rPr>
+          <w:rFonts w:eastAsia="Calibri" w:cs="Calibri"/>
+          <w:sz w:val="24"/>
+        </w:rPr>
+        <w:tab/>
+        <w:t>D she is interested I competing in the race</w:t>
+      </w:r>
+    </w:p>
+    <w:p>
+      <w:pPr>
+        <w:spacing w:line="254" w:lineRule="auto"/>
+        <w:rPr>
+          <w:rFonts w:eastAsia="Calibri" w:cs="Calibri"/>
+          <w:sz w:val="24"/>
+        </w:rPr>
+      </w:pPr>
+      <w:r>
+        <w:rPr>
+          <w:rFonts w:eastAsia="Calibri" w:cs="Calibri"/>
+          <w:sz w:val="24"/>
+          <w:highlight w:val="lightGray"/>
+        </w:rPr>
         <w:lastRenderedPageBreak/>
-        <w:t xml:space="preserve">C she hopes the manager will participate </w:t>
-      </w:r>
-      <w:r>
-        <w:rPr>
-          <w:rFonts w:eastAsia="Calibri" w:cs="Calibri"/>
-          <w:sz w:val="24"/>
-        </w:rPr>
-        <w:tab/>
-      </w:r>
-      <w:r>
-        <w:rPr>
-          <w:rFonts w:eastAsia="Calibri" w:cs="Calibri"/>
-          <w:sz w:val="24"/>
-        </w:rPr>
-        <w:tab/>
-        <w:t>D she is interested I competing in the race</w:t>
-      </w:r>
-    </w:p>
-    <w:p>
-      <w:pPr>
-        <w:spacing w:line="254" w:lineRule="auto"/>
-        <w:rPr>
-          <w:rFonts w:eastAsia="Calibri" w:cs="Calibri"/>
-          <w:sz w:val="24"/>
-        </w:rPr>
-      </w:pPr>
-      <w:r>
-        <w:rPr>
-          <w:rFonts w:eastAsia="Calibri" w:cs="Calibri"/>
-          <w:sz w:val="24"/>
-          <w:highlight w:val="lightGray"/>
-        </w:rPr>
         <w:t xml:space="preserve">Questions 172 - 175 refer to the following </w:t>
       </w:r>
       <w:r>
@@ -23084,7 +24068,15 @@
           <w:rFonts w:eastAsia="Calibri" w:cs="Calibri"/>
           <w:sz w:val="24"/>
         </w:rPr>
-        <w:t>A to ask for a job</w:t>
+        <w:t xml:space="preserve">A </w:t>
+      </w:r>
+      <w:r>
+        <w:rPr>
+          <w:rFonts w:eastAsia="Calibri" w:cs="Calibri"/>
+          <w:sz w:val="24"/>
+          <w:highlight w:val="yellow"/>
+        </w:rPr>
+        <w:t>to ask for a job</w:t>
       </w:r>
       <w:r>
         <w:rPr>
@@ -23129,49 +24121,49 @@
           <w:rFonts w:eastAsia="Calibri" w:cs="Calibri"/>
           <w:sz w:val="24"/>
         </w:rPr>
+        <w:t xml:space="preserve">C to offer employment </w:t>
+      </w:r>
+      <w:r>
+        <w:rPr>
+          <w:rFonts w:eastAsia="Calibri" w:cs="Calibri"/>
+          <w:sz w:val="24"/>
+        </w:rPr>
+        <w:tab/>
+      </w:r>
+      <w:r>
+        <w:rPr>
+          <w:rFonts w:eastAsia="Calibri" w:cs="Calibri"/>
+          <w:sz w:val="24"/>
+        </w:rPr>
+        <w:tab/>
+        <w:t xml:space="preserve">D to request information </w:t>
+      </w:r>
+    </w:p>
+    <w:p>
+      <w:pPr>
+        <w:spacing w:after="0"/>
+        <w:rPr>
+          <w:rFonts w:eastAsia="Calibri" w:cs="Calibri"/>
+          <w:sz w:val="24"/>
+        </w:rPr>
+      </w:pPr>
+    </w:p>
+    <w:p>
+      <w:pPr>
+        <w:spacing w:after="0"/>
+        <w:rPr>
+          <w:rFonts w:eastAsia="Calibri" w:cs="Calibri"/>
+          <w:color w:val="0070C0"/>
+          <w:sz w:val="24"/>
+        </w:rPr>
+      </w:pPr>
+      <w:r>
+        <w:rPr>
+          <w:rFonts w:eastAsia="Calibri" w:cs="Calibri"/>
+          <w:color w:val="0070C0"/>
+          <w:sz w:val="24"/>
+        </w:rPr>
         <w:lastRenderedPageBreak/>
-        <w:t xml:space="preserve">C to offer employment </w:t>
-      </w:r>
-      <w:r>
-        <w:rPr>
-          <w:rFonts w:eastAsia="Calibri" w:cs="Calibri"/>
-          <w:sz w:val="24"/>
-        </w:rPr>
-        <w:tab/>
-      </w:r>
-      <w:r>
-        <w:rPr>
-          <w:rFonts w:eastAsia="Calibri" w:cs="Calibri"/>
-          <w:sz w:val="24"/>
-        </w:rPr>
-        <w:tab/>
-        <w:t xml:space="preserve">D to request information </w:t>
-      </w:r>
-    </w:p>
-    <w:p>
-      <w:pPr>
-        <w:spacing w:after="0"/>
-        <w:rPr>
-          <w:rFonts w:eastAsia="Calibri" w:cs="Calibri"/>
-          <w:sz w:val="24"/>
-        </w:rPr>
-      </w:pPr>
-    </w:p>
-    <w:p>
-      <w:pPr>
-        <w:spacing w:after="0"/>
-        <w:rPr>
-          <w:rFonts w:eastAsia="Calibri" w:cs="Calibri"/>
-          <w:color w:val="0070C0"/>
-          <w:sz w:val="24"/>
-        </w:rPr>
-      </w:pPr>
-      <w:r>
-        <w:rPr>
-          <w:rFonts w:eastAsia="Calibri" w:cs="Calibri"/>
-          <w:color w:val="0070C0"/>
-          <w:sz w:val="24"/>
-        </w:rPr>
         <w:t xml:space="preserve">173 What did Jason study in college? </w:t>
       </w:r>
     </w:p>
@@ -23203,7 +24195,22 @@
           <w:sz w:val="24"/>
         </w:rPr>
         <w:tab/>
-        <w:t xml:space="preserve">B business   </w:t>
+        <w:t xml:space="preserve">B </w:t>
+      </w:r>
+      <w:r>
+        <w:rPr>
+          <w:rFonts w:eastAsia="Calibri" w:cs="Calibri"/>
+          <w:sz w:val="24"/>
+          <w:highlight w:val="yellow"/>
+        </w:rPr>
+        <w:t>business</w:t>
+      </w:r>
+      <w:r>
+        <w:rPr>
+          <w:rFonts w:eastAsia="Calibri" w:cs="Calibri"/>
+          <w:sz w:val="24"/>
+        </w:rPr>
+        <w:t xml:space="preserve">   </w:t>
       </w:r>
       <w:r>
         <w:rPr>
@@ -23301,7 +24308,22 @@
           <w:sz w:val="24"/>
         </w:rPr>
         <w:tab/>
-        <w:t xml:space="preserve">B published   </w:t>
+        <w:t xml:space="preserve">B </w:t>
+      </w:r>
+      <w:r>
+        <w:rPr>
+          <w:rFonts w:eastAsia="Calibri" w:cs="Calibri"/>
+          <w:sz w:val="24"/>
+          <w:highlight w:val="yellow"/>
+        </w:rPr>
+        <w:t>published</w:t>
+      </w:r>
+      <w:r>
+        <w:rPr>
+          <w:rFonts w:eastAsia="Calibri" w:cs="Calibri"/>
+          <w:sz w:val="24"/>
+        </w:rPr>
+        <w:t xml:space="preserve">   </w:t>
       </w:r>
       <w:r>
         <w:rPr>
@@ -23424,7 +24446,15 @@
           <w:sz w:val="24"/>
         </w:rPr>
         <w:tab/>
-        <w:t>B [2]</w:t>
+        <w:t xml:space="preserve">B </w:t>
+      </w:r>
+      <w:r>
+        <w:rPr>
+          <w:rFonts w:eastAsia="Calibri" w:cs="Calibri"/>
+          <w:sz w:val="24"/>
+          <w:highlight w:val="red"/>
+        </w:rPr>
+        <w:t>[2]</w:t>
       </w:r>
       <w:r>
         <w:rPr>
@@ -23468,7 +24498,22 @@
           <w:sz w:val="24"/>
         </w:rPr>
         <w:tab/>
-        <w:t xml:space="preserve">D [4] </w:t>
+        <w:t>D [</w:t>
+      </w:r>
+      <w:r>
+        <w:rPr>
+          <w:rFonts w:eastAsia="Calibri" w:cs="Calibri"/>
+          <w:sz w:val="24"/>
+          <w:highlight w:val="yellow"/>
+        </w:rPr>
+        <w:t>4]</w:t>
+      </w:r>
+      <w:r>
+        <w:rPr>
+          <w:rFonts w:eastAsia="Calibri" w:cs="Calibri"/>
+          <w:sz w:val="24"/>
+        </w:rPr>
+        <w:t xml:space="preserve"> </w:t>
       </w:r>
     </w:p>
     <w:p>
@@ -23734,7 +24779,6 @@
           <w:b/>
           <w:sz w:val="24"/>
         </w:rPr>
-        <w:lastRenderedPageBreak/>
         <w:t>Subject</w:t>
       </w:r>
       <w:r>
@@ -23780,6 +24824,7 @@
           <w:rFonts w:eastAsia="Calibri" w:cs="Calibri"/>
           <w:sz w:val="24"/>
         </w:rPr>
+        <w:lastRenderedPageBreak/>
         <w:t>Earl,</w:t>
       </w:r>
     </w:p>
@@ -23962,7 +25007,15 @@
           <w:rFonts w:eastAsia="Calibri" w:cs="Calibri"/>
           <w:sz w:val="24"/>
         </w:rPr>
-        <w:t>C it costs less to watch movies at home</w:t>
+        <w:t xml:space="preserve">C </w:t>
+      </w:r>
+      <w:r>
+        <w:rPr>
+          <w:rFonts w:eastAsia="Calibri" w:cs="Calibri"/>
+          <w:sz w:val="24"/>
+          <w:highlight w:val="yellow"/>
+        </w:rPr>
+        <w:t>it costs less to watch movies at home</w:t>
       </w:r>
       <w:r>
         <w:rPr>
@@ -24036,6 +25089,7 @@
         <w:rPr>
           <w:rFonts w:eastAsia="Calibri" w:cs="Calibri"/>
           <w:sz w:val="24"/>
+          <w:highlight w:val="yellow"/>
         </w:rPr>
         <w:t>a</w:t>
       </w:r>
@@ -24044,6 +25098,7 @@
         <w:rPr>
           <w:rFonts w:eastAsia="Calibri" w:cs="Calibri"/>
           <w:sz w:val="24"/>
+          <w:highlight w:val="yellow"/>
         </w:rPr>
         <w:t xml:space="preserve"> movie theater owner</w:t>
       </w:r>
@@ -24187,30 +25242,61 @@
           <w:sz w:val="24"/>
         </w:rPr>
         <w:tab/>
-        <w:t xml:space="preserve">B 30%   </w:t>
-      </w:r>
-      <w:r>
-        <w:rPr>
-          <w:rFonts w:eastAsia="Calibri" w:cs="Calibri"/>
-          <w:sz w:val="24"/>
-        </w:rPr>
-        <w:tab/>
-      </w:r>
-      <w:r>
-        <w:rPr>
-          <w:rFonts w:eastAsia="Calibri" w:cs="Calibri"/>
-          <w:sz w:val="24"/>
-        </w:rPr>
-        <w:tab/>
-        <w:t>C 50</w:t>
+        <w:t xml:space="preserve">B </w:t>
+      </w:r>
+      <w:r>
+        <w:rPr>
+          <w:rFonts w:eastAsia="Calibri" w:cs="Calibri"/>
+          <w:sz w:val="24"/>
+          <w:highlight w:val="red"/>
+        </w:rPr>
+        <w:t>30%</w:t>
+      </w:r>
+      <w:r>
+        <w:rPr>
+          <w:rFonts w:eastAsia="Calibri" w:cs="Calibri"/>
+          <w:sz w:val="24"/>
+        </w:rPr>
+        <w:t xml:space="preserve">   </w:t>
+      </w:r>
+      <w:r>
+        <w:rPr>
+          <w:rFonts w:eastAsia="Calibri" w:cs="Calibri"/>
+          <w:sz w:val="24"/>
+        </w:rPr>
+        <w:tab/>
+      </w:r>
+      <w:r>
+        <w:rPr>
+          <w:rFonts w:eastAsia="Calibri" w:cs="Calibri"/>
+          <w:sz w:val="24"/>
+        </w:rPr>
+        <w:tab/>
+        <w:t xml:space="preserve">C </w:t>
+      </w:r>
+      <w:r>
+        <w:rPr>
+          <w:rFonts w:eastAsia="Calibri" w:cs="Calibri"/>
+          <w:sz w:val="24"/>
+          <w:highlight w:val="yellow"/>
+        </w:rPr>
+        <w:t>50</w:t>
       </w:r>
       <w:proofErr w:type="gramStart"/>
       <w:r>
         <w:rPr>
           <w:rFonts w:eastAsia="Calibri" w:cs="Calibri"/>
           <w:sz w:val="24"/>
-        </w:rPr>
-        <w:t xml:space="preserve">%  </w:t>
+          <w:highlight w:val="yellow"/>
+        </w:rPr>
+        <w:t>%</w:t>
+      </w:r>
+      <w:r>
+        <w:rPr>
+          <w:rFonts w:eastAsia="Calibri" w:cs="Calibri"/>
+          <w:sz w:val="24"/>
+        </w:rPr>
+        <w:t xml:space="preserve">  </w:t>
       </w:r>
       <w:r>
         <w:rPr>
@@ -24285,29 +25371,45 @@
           <w:rFonts w:eastAsia="Calibri" w:cs="Calibri"/>
           <w:sz w:val="24"/>
         </w:rPr>
-        <w:t>A drinks</w:t>
-      </w:r>
-      <w:r>
-        <w:rPr>
-          <w:rFonts w:eastAsia="Calibri" w:cs="Calibri"/>
-          <w:sz w:val="24"/>
-        </w:rPr>
-        <w:tab/>
-      </w:r>
-      <w:r>
-        <w:rPr>
-          <w:rFonts w:eastAsia="Calibri" w:cs="Calibri"/>
-          <w:sz w:val="24"/>
-        </w:rPr>
-        <w:tab/>
-      </w:r>
-      <w:r>
-        <w:rPr>
-          <w:rFonts w:eastAsia="Calibri" w:cs="Calibri"/>
-          <w:sz w:val="24"/>
-        </w:rPr>
-        <w:tab/>
-        <w:t>B food</w:t>
+        <w:t xml:space="preserve">A </w:t>
+      </w:r>
+      <w:r>
+        <w:rPr>
+          <w:rFonts w:eastAsia="Calibri" w:cs="Calibri"/>
+          <w:sz w:val="24"/>
+          <w:highlight w:val="red"/>
+        </w:rPr>
+        <w:t>drinks</w:t>
+      </w:r>
+      <w:r>
+        <w:rPr>
+          <w:rFonts w:eastAsia="Calibri" w:cs="Calibri"/>
+          <w:sz w:val="24"/>
+        </w:rPr>
+        <w:tab/>
+      </w:r>
+      <w:r>
+        <w:rPr>
+          <w:rFonts w:eastAsia="Calibri" w:cs="Calibri"/>
+          <w:sz w:val="24"/>
+        </w:rPr>
+        <w:tab/>
+      </w:r>
+      <w:r>
+        <w:rPr>
+          <w:rFonts w:eastAsia="Calibri" w:cs="Calibri"/>
+          <w:sz w:val="24"/>
+        </w:rPr>
+        <w:tab/>
+        <w:t xml:space="preserve">B </w:t>
+      </w:r>
+      <w:r>
+        <w:rPr>
+          <w:rFonts w:eastAsia="Calibri" w:cs="Calibri"/>
+          <w:sz w:val="24"/>
+          <w:highlight w:val="yellow"/>
+        </w:rPr>
+        <w:t>food</w:t>
       </w:r>
       <w:r>
         <w:rPr>
@@ -24433,22 +25535,52 @@
           <w:sz w:val="24"/>
         </w:rPr>
         <w:tab/>
-        <w:t xml:space="preserve">C Wednesday </w:t>
-      </w:r>
-      <w:r>
-        <w:rPr>
-          <w:rFonts w:eastAsia="Calibri" w:cs="Calibri"/>
-          <w:sz w:val="24"/>
-        </w:rPr>
-        <w:tab/>
-      </w:r>
-      <w:r>
-        <w:rPr>
-          <w:rFonts w:eastAsia="Calibri" w:cs="Calibri"/>
-          <w:sz w:val="24"/>
-        </w:rPr>
-        <w:tab/>
-        <w:t xml:space="preserve">D Thursday  </w:t>
+        <w:t xml:space="preserve">C </w:t>
+      </w:r>
+      <w:r>
+        <w:rPr>
+          <w:rFonts w:eastAsia="Calibri" w:cs="Calibri"/>
+          <w:sz w:val="24"/>
+          <w:highlight w:val="yellow"/>
+        </w:rPr>
+        <w:t>Wednesday</w:t>
+      </w:r>
+      <w:r>
+        <w:rPr>
+          <w:rFonts w:eastAsia="Calibri" w:cs="Calibri"/>
+          <w:sz w:val="24"/>
+        </w:rPr>
+        <w:t xml:space="preserve"> </w:t>
+      </w:r>
+      <w:r>
+        <w:rPr>
+          <w:rFonts w:eastAsia="Calibri" w:cs="Calibri"/>
+          <w:sz w:val="24"/>
+        </w:rPr>
+        <w:tab/>
+      </w:r>
+      <w:r>
+        <w:rPr>
+          <w:rFonts w:eastAsia="Calibri" w:cs="Calibri"/>
+          <w:sz w:val="24"/>
+        </w:rPr>
+        <w:tab/>
+        <w:t xml:space="preserve">D </w:t>
+      </w:r>
+      <w:r>
+        <w:rPr>
+          <w:rFonts w:eastAsia="Calibri" w:cs="Calibri"/>
+          <w:sz w:val="24"/>
+          <w:highlight w:val="red"/>
+        </w:rPr>
+        <w:t>Thursday</w:t>
+      </w:r>
+      <w:r>
+        <w:rPr>
+          <w:rFonts w:eastAsia="Calibri" w:cs="Calibri"/>
+          <w:sz w:val="24"/>
+        </w:rPr>
+        <w:t xml:space="preserve">  </w:t>
       </w:r>
     </w:p>
     <w:p>
@@ -24506,7 +25638,6 @@
           <w:b/>
           <w:sz w:val="24"/>
         </w:rPr>
-        <w:lastRenderedPageBreak/>
         <w:t>From</w:t>
       </w:r>
       <w:r>
@@ -24569,6 +25700,7 @@
           <w:b/>
           <w:sz w:val="24"/>
         </w:rPr>
+        <w:lastRenderedPageBreak/>
         <w:t>Date</w:t>
       </w:r>
       <w:r>
@@ -25114,7 +26246,6 @@
           <w:rFonts w:eastAsia="Calibri" w:cs="Calibri"/>
           <w:sz w:val="24"/>
         </w:rPr>
-        <w:lastRenderedPageBreak/>
         <w:t>Beommul</w:t>
       </w:r>
       <w:proofErr w:type="spellEnd"/>
@@ -25192,6 +26323,7 @@
           <w:rFonts w:eastAsia="Calibri" w:cs="Calibri"/>
           <w:sz w:val="24"/>
         </w:rPr>
+        <w:lastRenderedPageBreak/>
         <w:t>South Korea</w:t>
       </w:r>
     </w:p>
@@ -25506,7 +26638,15 @@
           <w:rFonts w:eastAsia="Calibri" w:cs="Calibri"/>
           <w:sz w:val="24"/>
         </w:rPr>
-        <w:t>A he was responding to Choi’s request</w:t>
+        <w:t xml:space="preserve">A </w:t>
+      </w:r>
+      <w:r>
+        <w:rPr>
+          <w:rFonts w:eastAsia="Calibri" w:cs="Calibri"/>
+          <w:sz w:val="24"/>
+          <w:highlight w:val="yellow"/>
+        </w:rPr>
+        <w:t>he was responding to Choi’s request</w:t>
       </w:r>
       <w:r>
         <w:rPr>
@@ -25694,7 +26834,22 @@
           <w:sz w:val="24"/>
         </w:rPr>
         <w:tab/>
-        <w:t xml:space="preserve">D he was doing the work of two people </w:t>
+        <w:t xml:space="preserve">D </w:t>
+      </w:r>
+      <w:r>
+        <w:rPr>
+          <w:rFonts w:eastAsia="Calibri" w:cs="Calibri"/>
+          <w:sz w:val="24"/>
+          <w:highlight w:val="yellow"/>
+        </w:rPr>
+        <w:t>he was doing the work of two people</w:t>
+      </w:r>
+      <w:r>
+        <w:rPr>
+          <w:rFonts w:eastAsia="Calibri" w:cs="Calibri"/>
+          <w:sz w:val="24"/>
+        </w:rPr>
+        <w:t xml:space="preserve"> </w:t>
       </w:r>
     </w:p>
     <w:p>
@@ -25739,6 +26894,7 @@
           <w:rFonts w:eastAsia="Calibri" w:cs="Calibri"/>
           <w:sz w:val="24"/>
         </w:rPr>
+        <w:lastRenderedPageBreak/>
         <w:t>A the</w:t>
       </w:r>
       <w:proofErr w:type="gramEnd"/>
@@ -25792,6 +26948,7 @@
         <w:rPr>
           <w:rFonts w:eastAsia="Calibri" w:cs="Calibri"/>
           <w:sz w:val="24"/>
+          <w:highlight w:val="yellow"/>
         </w:rPr>
         <w:t>Geum</w:t>
       </w:r>
@@ -25800,6 +26957,7 @@
         <w:rPr>
           <w:rFonts w:eastAsia="Calibri" w:cs="Calibri"/>
           <w:sz w:val="24"/>
+          <w:highlight w:val="yellow"/>
         </w:rPr>
         <w:t xml:space="preserve"> jewelers had low sales this </w:t>
       </w:r>
@@ -25808,8 +26966,16 @@
         <w:rPr>
           <w:rFonts w:eastAsia="Calibri" w:cs="Calibri"/>
           <w:sz w:val="24"/>
-        </w:rPr>
-        <w:t xml:space="preserve">year  </w:t>
+          <w:highlight w:val="yellow"/>
+        </w:rPr>
+        <w:t>year</w:t>
+      </w:r>
+      <w:r>
+        <w:rPr>
+          <w:rFonts w:eastAsia="Calibri" w:cs="Calibri"/>
+          <w:sz w:val="24"/>
+        </w:rPr>
+        <w:t xml:space="preserve">  </w:t>
       </w:r>
       <w:r>
         <w:rPr>
@@ -25894,13 +27060,22 @@
           <w:rFonts w:eastAsia="Calibri" w:cs="Calibri"/>
           <w:sz w:val="24"/>
         </w:rPr>
-        <w:t xml:space="preserve">A sales </w:t>
+        <w:t xml:space="preserve">A </w:t>
+      </w:r>
+      <w:r>
+        <w:rPr>
+          <w:rFonts w:eastAsia="Calibri" w:cs="Calibri"/>
+          <w:sz w:val="24"/>
+          <w:highlight w:val="yellow"/>
+        </w:rPr>
+        <w:t xml:space="preserve">sales </w:t>
       </w:r>
       <w:proofErr w:type="gramStart"/>
       <w:r>
         <w:rPr>
           <w:rFonts w:eastAsia="Calibri" w:cs="Calibri"/>
           <w:sz w:val="24"/>
+          <w:highlight w:val="yellow"/>
         </w:rPr>
         <w:t>supervisors</w:t>
       </w:r>
@@ -26004,6 +27179,7 @@
         <w:rPr>
           <w:rFonts w:eastAsia="Calibri" w:cs="Calibri"/>
           <w:sz w:val="24"/>
+          <w:highlight w:val="red"/>
         </w:rPr>
         <w:t>A</w:t>
       </w:r>
@@ -26012,6 +27188,7 @@
         <w:rPr>
           <w:rFonts w:eastAsia="Calibri" w:cs="Calibri"/>
           <w:sz w:val="24"/>
+          <w:highlight w:val="red"/>
         </w:rPr>
         <w:t xml:space="preserve"> apply to be </w:t>
       </w:r>
@@ -26020,6 +27197,7 @@
         <w:rPr>
           <w:rFonts w:eastAsia="Calibri" w:cs="Calibri"/>
           <w:sz w:val="24"/>
+          <w:highlight w:val="red"/>
         </w:rPr>
         <w:t>Geum</w:t>
       </w:r>
@@ -26028,6 +27206,7 @@
         <w:rPr>
           <w:rFonts w:eastAsia="Calibri" w:cs="Calibri"/>
           <w:sz w:val="24"/>
+          <w:highlight w:val="red"/>
         </w:rPr>
         <w:t xml:space="preserve"> </w:t>
       </w:r>
@@ -26036,6 +27215,7 @@
         <w:rPr>
           <w:rFonts w:eastAsia="Calibri" w:cs="Calibri"/>
           <w:sz w:val="24"/>
+          <w:highlight w:val="red"/>
         </w:rPr>
         <w:t>jewelery’s</w:t>
       </w:r>
@@ -26044,8 +27224,16 @@
         <w:rPr>
           <w:rFonts w:eastAsia="Calibri" w:cs="Calibri"/>
           <w:sz w:val="24"/>
-        </w:rPr>
-        <w:t xml:space="preserve"> marketing director </w:t>
+          <w:highlight w:val="red"/>
+        </w:rPr>
+        <w:t xml:space="preserve"> marketing director</w:t>
+      </w:r>
+      <w:r>
+        <w:rPr>
+          <w:rFonts w:eastAsia="Calibri" w:cs="Calibri"/>
+          <w:sz w:val="24"/>
+        </w:rPr>
+        <w:t xml:space="preserve"> </w:t>
       </w:r>
       <w:r>
         <w:rPr>
@@ -26098,7 +27286,22 @@
           <w:sz w:val="24"/>
         </w:rPr>
         <w:tab/>
-        <w:t xml:space="preserve">D do some consulting work for Kim  </w:t>
+        <w:t xml:space="preserve">D </w:t>
+      </w:r>
+      <w:r>
+        <w:rPr>
+          <w:rFonts w:eastAsia="Calibri" w:cs="Calibri"/>
+          <w:sz w:val="24"/>
+          <w:highlight w:val="yellow"/>
+        </w:rPr>
+        <w:t>do some consulting work for</w:t>
+      </w:r>
+      <w:r>
+        <w:rPr>
+          <w:rFonts w:eastAsia="Calibri" w:cs="Calibri"/>
+          <w:sz w:val="24"/>
+        </w:rPr>
+        <w:t xml:space="preserve"> Kim  </w:t>
       </w:r>
     </w:p>
     <w:p>
@@ -26481,7 +27684,6 @@
           <w:rFonts w:eastAsia="Calibri" w:cs="Calibri"/>
           <w:sz w:val="24"/>
         </w:rPr>
-        <w:lastRenderedPageBreak/>
         <w:t>Andheri East</w:t>
       </w:r>
     </w:p>
@@ -27270,6 +28472,7 @@
         <w:rPr>
           <w:rFonts w:eastAsia="Calibri" w:cs="Calibri"/>
         </w:rPr>
+        <w:lastRenderedPageBreak/>
         <w:t xml:space="preserve">Note: thank you for your work this month, Ari. Sorry this payment is a week late. My accountant is away this week and I forgot about your invoice. I added 2 % to your bill to cover the late fees.  I like this new payment format. I think it will make it easier on both of us, and I prefer not to use my credit card anyway. </w:t>
       </w:r>
     </w:p>
@@ -27816,7 +29019,15 @@
           <w:sz w:val="24"/>
         </w:rPr>
         <w:tab/>
-        <w:t>B $100</w:t>
+        <w:t xml:space="preserve">B </w:t>
+      </w:r>
+      <w:r>
+        <w:rPr>
+          <w:rFonts w:eastAsia="Calibri" w:cs="Calibri"/>
+          <w:sz w:val="24"/>
+          <w:highlight w:val="red"/>
+        </w:rPr>
+        <w:t>$100</w:t>
       </w:r>
       <w:r>
         <w:rPr>
@@ -27860,102 +29071,118 @@
           <w:sz w:val="24"/>
         </w:rPr>
         <w:tab/>
-        <w:t>D $20/hour</w:t>
-      </w:r>
-    </w:p>
-    <w:p>
-      <w:pPr>
-        <w:spacing w:after="0"/>
-        <w:rPr>
-          <w:rFonts w:eastAsia="Calibri" w:cs="Calibri"/>
-          <w:sz w:val="24"/>
-        </w:rPr>
-      </w:pPr>
-    </w:p>
-    <w:p>
-      <w:pPr>
-        <w:spacing w:after="0"/>
-        <w:rPr>
-          <w:rFonts w:eastAsia="Calibri" w:cs="Calibri"/>
-          <w:color w:val="0070C0"/>
-          <w:sz w:val="24"/>
-        </w:rPr>
-      </w:pPr>
-      <w:r>
-        <w:rPr>
-          <w:rFonts w:eastAsia="Calibri" w:cs="Calibri"/>
-          <w:color w:val="0070C0"/>
+        <w:t xml:space="preserve">D </w:t>
+      </w:r>
+      <w:r>
+        <w:rPr>
+          <w:rFonts w:eastAsia="Calibri" w:cs="Calibri"/>
+          <w:sz w:val="24"/>
+          <w:highlight w:val="yellow"/>
+        </w:rPr>
+        <w:t>$20/hour</w:t>
+      </w:r>
+    </w:p>
+    <w:p>
+      <w:pPr>
+        <w:spacing w:after="0"/>
+        <w:rPr>
+          <w:rFonts w:eastAsia="Calibri" w:cs="Calibri"/>
+          <w:sz w:val="24"/>
+        </w:rPr>
+      </w:pPr>
+    </w:p>
+    <w:p>
+      <w:pPr>
+        <w:spacing w:after="0"/>
+        <w:rPr>
+          <w:rFonts w:eastAsia="Calibri" w:cs="Calibri"/>
+          <w:color w:val="0070C0"/>
+          <w:sz w:val="24"/>
+        </w:rPr>
+      </w:pPr>
+      <w:r>
+        <w:rPr>
+          <w:rFonts w:eastAsia="Calibri" w:cs="Calibri"/>
+          <w:color w:val="0070C0"/>
+          <w:sz w:val="24"/>
+        </w:rPr>
+        <w:t xml:space="preserve">187 When did Mike Wallace pay his bill? </w:t>
+      </w:r>
+    </w:p>
+    <w:p>
+      <w:pPr>
+        <w:spacing w:after="0"/>
+        <w:rPr>
+          <w:rFonts w:eastAsia="Calibri" w:cs="Calibri"/>
+          <w:sz w:val="24"/>
+        </w:rPr>
+      </w:pPr>
+      <w:r>
+        <w:rPr>
+          <w:rFonts w:eastAsia="Calibri" w:cs="Calibri"/>
+          <w:sz w:val="24"/>
+        </w:rPr>
+        <w:t>A before the due date</w:t>
+      </w:r>
+      <w:r>
+        <w:rPr>
+          <w:rFonts w:eastAsia="Calibri" w:cs="Calibri"/>
+          <w:sz w:val="24"/>
+        </w:rPr>
+        <w:tab/>
+      </w:r>
+      <w:r>
+        <w:rPr>
+          <w:rFonts w:eastAsia="Calibri" w:cs="Calibri"/>
+          <w:sz w:val="24"/>
+        </w:rPr>
+        <w:tab/>
+      </w:r>
+      <w:r>
+        <w:rPr>
+          <w:rFonts w:eastAsia="Calibri" w:cs="Calibri"/>
+          <w:sz w:val="24"/>
+        </w:rPr>
+        <w:tab/>
+      </w:r>
+      <w:r>
+        <w:rPr>
+          <w:rFonts w:eastAsia="Calibri" w:cs="Calibri"/>
+          <w:sz w:val="24"/>
+        </w:rPr>
+        <w:tab/>
+        <w:t xml:space="preserve">B </w:t>
+      </w:r>
+      <w:r>
+        <w:rPr>
+          <w:rFonts w:eastAsia="Calibri" w:cs="Calibri"/>
+          <w:sz w:val="24"/>
+          <w:highlight w:val="yellow"/>
+        </w:rPr>
+        <w:t>on Feb 9th</w:t>
+      </w:r>
+      <w:r>
+        <w:rPr>
+          <w:rFonts w:eastAsia="Calibri" w:cs="Calibri"/>
+          <w:sz w:val="24"/>
+        </w:rPr>
+        <w:tab/>
+      </w:r>
+    </w:p>
+    <w:p>
+      <w:pPr>
+        <w:spacing w:after="0"/>
+        <w:rPr>
+          <w:rFonts w:eastAsia="Calibri" w:cs="Calibri"/>
+          <w:sz w:val="24"/>
+        </w:rPr>
+      </w:pPr>
+      <w:r>
+        <w:rPr>
+          <w:rFonts w:eastAsia="Calibri" w:cs="Calibri"/>
           <w:sz w:val="24"/>
         </w:rPr>
         <w:lastRenderedPageBreak/>
-        <w:t xml:space="preserve">187 When did Mike Wallace pay his bill? </w:t>
-      </w:r>
-    </w:p>
-    <w:p>
-      <w:pPr>
-        <w:spacing w:after="0"/>
-        <w:rPr>
-          <w:rFonts w:eastAsia="Calibri" w:cs="Calibri"/>
-          <w:sz w:val="24"/>
-        </w:rPr>
-      </w:pPr>
-      <w:r>
-        <w:rPr>
-          <w:rFonts w:eastAsia="Calibri" w:cs="Calibri"/>
-          <w:sz w:val="24"/>
-        </w:rPr>
-        <w:t>A before the due date</w:t>
-      </w:r>
-      <w:r>
-        <w:rPr>
-          <w:rFonts w:eastAsia="Calibri" w:cs="Calibri"/>
-          <w:sz w:val="24"/>
-        </w:rPr>
-        <w:tab/>
-      </w:r>
-      <w:r>
-        <w:rPr>
-          <w:rFonts w:eastAsia="Calibri" w:cs="Calibri"/>
-          <w:sz w:val="24"/>
-        </w:rPr>
-        <w:tab/>
-      </w:r>
-      <w:r>
-        <w:rPr>
-          <w:rFonts w:eastAsia="Calibri" w:cs="Calibri"/>
-          <w:sz w:val="24"/>
-        </w:rPr>
-        <w:tab/>
-      </w:r>
-      <w:r>
-        <w:rPr>
-          <w:rFonts w:eastAsia="Calibri" w:cs="Calibri"/>
-          <w:sz w:val="24"/>
-        </w:rPr>
-        <w:tab/>
-        <w:t>B on Feb 9th</w:t>
-      </w:r>
-      <w:r>
-        <w:rPr>
-          <w:rFonts w:eastAsia="Calibri" w:cs="Calibri"/>
-          <w:sz w:val="24"/>
-        </w:rPr>
-        <w:tab/>
-      </w:r>
-    </w:p>
-    <w:p>
-      <w:pPr>
-        <w:spacing w:after="0"/>
-        <w:rPr>
-          <w:rFonts w:eastAsia="Calibri" w:cs="Calibri"/>
-          <w:sz w:val="24"/>
-        </w:rPr>
-      </w:pPr>
-      <w:r>
-        <w:rPr>
-          <w:rFonts w:eastAsia="Calibri" w:cs="Calibri"/>
-          <w:sz w:val="24"/>
-        </w:rPr>
         <w:t>C 5 days after   the due date</w:t>
       </w:r>
       <w:r>
@@ -27978,7 +29205,15 @@
           <w:sz w:val="24"/>
         </w:rPr>
         <w:tab/>
-        <w:t>D about 1 week</w:t>
+        <w:t xml:space="preserve">D </w:t>
+      </w:r>
+      <w:r>
+        <w:rPr>
+          <w:rFonts w:eastAsia="Calibri" w:cs="Calibri"/>
+          <w:sz w:val="24"/>
+          <w:highlight w:val="red"/>
+        </w:rPr>
+        <w:t>about 1 week</w:t>
       </w:r>
     </w:p>
     <w:p>
@@ -28022,7 +29257,15 @@
           <w:rFonts w:eastAsia="Calibri" w:cs="Calibri"/>
           <w:sz w:val="24"/>
         </w:rPr>
-        <w:t>A $19.70</w:t>
+        <w:t xml:space="preserve">A </w:t>
+      </w:r>
+      <w:r>
+        <w:rPr>
+          <w:rFonts w:eastAsia="Calibri" w:cs="Calibri"/>
+          <w:color w:val="FF0000"/>
+          <w:sz w:val="24"/>
+        </w:rPr>
+        <w:t>$19.70</w:t>
       </w:r>
       <w:r>
         <w:rPr>
@@ -28067,7 +29310,15 @@
           <w:sz w:val="24"/>
         </w:rPr>
         <w:tab/>
-        <w:t>D $1,004.70</w:t>
+        <w:t xml:space="preserve">D </w:t>
+      </w:r>
+      <w:r>
+        <w:rPr>
+          <w:rFonts w:eastAsia="Calibri" w:cs="Calibri"/>
+          <w:sz w:val="24"/>
+          <w:highlight w:val="yellow"/>
+        </w:rPr>
+        <w:t>$1,004.70</w:t>
       </w:r>
     </w:p>
     <w:p>
@@ -28119,7 +29370,22 @@
           <w:rFonts w:eastAsia="Calibri" w:cs="Calibri"/>
           <w:sz w:val="24"/>
         </w:rPr>
-        <w:t xml:space="preserve">A he thinks it is convenient </w:t>
+        <w:t xml:space="preserve">A </w:t>
+      </w:r>
+      <w:r>
+        <w:rPr>
+          <w:rFonts w:eastAsia="Calibri" w:cs="Calibri"/>
+          <w:sz w:val="24"/>
+          <w:highlight w:val="yellow"/>
+        </w:rPr>
+        <w:t>he thinks it is convenient</w:t>
+      </w:r>
+      <w:r>
+        <w:rPr>
+          <w:rFonts w:eastAsia="Calibri" w:cs="Calibri"/>
+          <w:sz w:val="24"/>
+        </w:rPr>
+        <w:t xml:space="preserve"> </w:t>
       </w:r>
       <w:r>
         <w:rPr>
@@ -28255,34 +29521,59 @@
           <w:rFonts w:eastAsia="Calibri" w:cs="Calibri"/>
           <w:sz w:val="24"/>
         </w:rPr>
-        <w:t xml:space="preserve">B after the money processes out of his client’s account </w:t>
-      </w:r>
-    </w:p>
-    <w:p>
-      <w:pPr>
-        <w:spacing w:after="0"/>
-        <w:rPr>
-          <w:rFonts w:eastAsia="Calibri" w:cs="Calibri"/>
-          <w:sz w:val="24"/>
-        </w:rPr>
-      </w:pPr>
-      <w:r>
-        <w:rPr>
-          <w:rFonts w:eastAsia="Calibri" w:cs="Calibri"/>
-          <w:sz w:val="24"/>
-        </w:rPr>
-        <w:t xml:space="preserve">C when he becomes a </w:t>
+        <w:t xml:space="preserve">B </w:t>
+      </w:r>
+      <w:r>
+        <w:rPr>
+          <w:rFonts w:eastAsia="Calibri" w:cs="Calibri"/>
+          <w:sz w:val="24"/>
+          <w:highlight w:val="red"/>
+        </w:rPr>
+        <w:t>after the money processes out of his client’s account</w:t>
+      </w:r>
+      <w:r>
+        <w:rPr>
+          <w:rFonts w:eastAsia="Calibri" w:cs="Calibri"/>
+          <w:sz w:val="24"/>
+        </w:rPr>
+        <w:t xml:space="preserve"> </w:t>
+      </w:r>
+    </w:p>
+    <w:p>
+      <w:pPr>
+        <w:spacing w:after="0"/>
+        <w:rPr>
+          <w:rFonts w:eastAsia="Calibri" w:cs="Calibri"/>
+          <w:sz w:val="24"/>
+        </w:rPr>
+      </w:pPr>
+      <w:r>
+        <w:rPr>
+          <w:rFonts w:eastAsia="Calibri" w:cs="Calibri"/>
+          <w:sz w:val="24"/>
+        </w:rPr>
+        <w:t xml:space="preserve">C </w:t>
+      </w:r>
+      <w:r>
+        <w:rPr>
+          <w:rFonts w:eastAsia="Calibri" w:cs="Calibri"/>
+          <w:sz w:val="24"/>
+          <w:highlight w:val="yellow"/>
+        </w:rPr>
+        <w:t xml:space="preserve">when he becomes a </w:t>
       </w:r>
       <w:r>
         <w:rPr>
           <w:rFonts w:eastAsia="Calibri" w:cs="Calibri"/>
           <w:i/>
+          <w:highlight w:val="yellow"/>
         </w:rPr>
         <w:t>PAYDAY NOW</w:t>
       </w:r>
       <w:r>
         <w:rPr>
           <w:rFonts w:eastAsia="Calibri" w:cs="Calibri"/>
+          <w:highlight w:val="yellow"/>
         </w:rPr>
         <w:t xml:space="preserve"> user</w:t>
       </w:r>
@@ -28733,7 +30024,6 @@
           <w:rFonts w:eastAsia="Calibri" w:cs="Calibri"/>
           <w:sz w:val="24"/>
         </w:rPr>
-        <w:lastRenderedPageBreak/>
         <w:t xml:space="preserve">Special requests: </w:t>
       </w:r>
       <w:r>
@@ -28799,6 +30089,7 @@
           <w:sz w:val="24"/>
           <w:u w:val="single"/>
         </w:rPr>
+        <w:lastRenderedPageBreak/>
         <w:t>Click here</w:t>
       </w:r>
       <w:r>
@@ -29607,6 +30898,7 @@
           <w:b/>
           <w:sz w:val="24"/>
         </w:rPr>
+        <w:lastRenderedPageBreak/>
         <w:t>Cleanliness</w:t>
       </w:r>
       <w:r>
@@ -29866,6 +31158,115 @@
           <w:rFonts w:eastAsia="Calibri" w:cs="Calibri"/>
           <w:sz w:val="24"/>
         </w:rPr>
+        <w:t xml:space="preserve">A </w:t>
+      </w:r>
+      <w:r>
+        <w:rPr>
+          <w:rFonts w:eastAsia="Calibri" w:cs="Calibri"/>
+          <w:sz w:val="24"/>
+          <w:highlight w:val="yellow"/>
+        </w:rPr>
+        <w:t>the</w:t>
+      </w:r>
+      <w:proofErr w:type="gramEnd"/>
+      <w:r>
+        <w:rPr>
+          <w:rFonts w:eastAsia="Calibri" w:cs="Calibri"/>
+          <w:sz w:val="24"/>
+          <w:highlight w:val="yellow"/>
+        </w:rPr>
+        <w:t xml:space="preserve"> car had left over garbage inside</w:t>
+      </w:r>
+    </w:p>
+    <w:p>
+      <w:pPr>
+        <w:spacing w:after="0"/>
+        <w:rPr>
+          <w:rFonts w:eastAsia="Calibri" w:cs="Calibri"/>
+          <w:sz w:val="24"/>
+        </w:rPr>
+      </w:pPr>
+      <w:r>
+        <w:rPr>
+          <w:rFonts w:eastAsia="Calibri" w:cs="Calibri"/>
+          <w:sz w:val="24"/>
+        </w:rPr>
+        <w:t xml:space="preserve">B the price was unreasonable </w:t>
+      </w:r>
+    </w:p>
+    <w:p>
+      <w:pPr>
+        <w:spacing w:after="0"/>
+        <w:rPr>
+          <w:rFonts w:eastAsia="Calibri" w:cs="Calibri"/>
+          <w:sz w:val="24"/>
+        </w:rPr>
+      </w:pPr>
+      <w:r>
+        <w:rPr>
+          <w:rFonts w:eastAsia="Calibri" w:cs="Calibri"/>
+          <w:sz w:val="24"/>
+        </w:rPr>
+        <w:t>C the child seat was the wrong style</w:t>
+      </w:r>
+    </w:p>
+    <w:p>
+      <w:pPr>
+        <w:spacing w:after="0"/>
+        <w:rPr>
+          <w:rFonts w:eastAsia="Calibri" w:cs="Calibri"/>
+          <w:sz w:val="24"/>
+        </w:rPr>
+      </w:pPr>
+      <w:r>
+        <w:rPr>
+          <w:rFonts w:eastAsia="Calibri" w:cs="Calibri"/>
+          <w:sz w:val="24"/>
+        </w:rPr>
+        <w:t>D the staff was helpful but could not fix the problem</w:t>
+      </w:r>
+    </w:p>
+    <w:p>
+      <w:pPr>
+        <w:spacing w:after="0"/>
+        <w:rPr>
+          <w:rFonts w:eastAsia="Calibri" w:cs="Calibri"/>
+          <w:sz w:val="24"/>
+        </w:rPr>
+      </w:pPr>
+    </w:p>
+    <w:p>
+      <w:pPr>
+        <w:spacing w:after="0"/>
+        <w:rPr>
+          <w:rFonts w:eastAsia="Calibri" w:cs="Calibri"/>
+          <w:color w:val="0070C0"/>
+          <w:sz w:val="24"/>
+        </w:rPr>
+      </w:pPr>
+      <w:r>
+        <w:rPr>
+          <w:rFonts w:eastAsia="Calibri" w:cs="Calibri"/>
+          <w:color w:val="0070C0"/>
+          <w:sz w:val="24"/>
+        </w:rPr>
+        <w:t xml:space="preserve">192 Which of the following did the customer NOT specify in his inquiry? </w:t>
+      </w:r>
+    </w:p>
+    <w:p>
+      <w:pPr>
+        <w:spacing w:after="0"/>
+        <w:rPr>
+          <w:rFonts w:eastAsia="Calibri" w:cs="Calibri"/>
+          <w:sz w:val="24"/>
+        </w:rPr>
+      </w:pPr>
+      <w:proofErr w:type="gramStart"/>
+      <w:r>
+        <w:rPr>
+          <w:rFonts w:eastAsia="Calibri" w:cs="Calibri"/>
+          <w:sz w:val="24"/>
+        </w:rPr>
         <w:t>A the</w:t>
       </w:r>
       <w:proofErr w:type="gramEnd"/>
@@ -29874,82 +31275,230 @@
           <w:rFonts w:eastAsia="Calibri" w:cs="Calibri"/>
           <w:sz w:val="24"/>
         </w:rPr>
-        <w:t xml:space="preserve"> car had left over garbage inside</w:t>
-      </w:r>
-    </w:p>
-    <w:p>
-      <w:pPr>
-        <w:spacing w:after="0"/>
-        <w:rPr>
-          <w:rFonts w:eastAsia="Calibri" w:cs="Calibri"/>
-          <w:sz w:val="24"/>
-        </w:rPr>
-      </w:pPr>
-      <w:r>
-        <w:rPr>
-          <w:rFonts w:eastAsia="Calibri" w:cs="Calibri"/>
-          <w:sz w:val="24"/>
-        </w:rPr>
-        <w:t xml:space="preserve">B the price was unreasonable </w:t>
-      </w:r>
-    </w:p>
-    <w:p>
-      <w:pPr>
-        <w:spacing w:after="0"/>
-        <w:rPr>
-          <w:rFonts w:eastAsia="Calibri" w:cs="Calibri"/>
-          <w:sz w:val="24"/>
-        </w:rPr>
-      </w:pPr>
-      <w:r>
-        <w:rPr>
-          <w:rFonts w:eastAsia="Calibri" w:cs="Calibri"/>
-          <w:sz w:val="24"/>
-        </w:rPr>
-        <w:t>C the child seat was the wrong style</w:t>
-      </w:r>
-    </w:p>
-    <w:p>
-      <w:pPr>
-        <w:spacing w:after="0"/>
-        <w:rPr>
-          <w:rFonts w:eastAsia="Calibri" w:cs="Calibri"/>
-          <w:sz w:val="24"/>
-        </w:rPr>
-      </w:pPr>
-      <w:r>
-        <w:rPr>
-          <w:rFonts w:eastAsia="Calibri" w:cs="Calibri"/>
-          <w:sz w:val="24"/>
-        </w:rPr>
-        <w:t>D the staff was helpful but could not fix the problem</w:t>
-      </w:r>
-    </w:p>
-    <w:p>
-      <w:pPr>
-        <w:spacing w:after="0"/>
-        <w:rPr>
-          <w:rFonts w:eastAsia="Calibri" w:cs="Calibri"/>
-          <w:sz w:val="24"/>
-        </w:rPr>
-      </w:pPr>
-    </w:p>
-    <w:p>
-      <w:pPr>
-        <w:spacing w:after="0"/>
-        <w:rPr>
-          <w:rFonts w:eastAsia="Calibri" w:cs="Calibri"/>
-          <w:color w:val="0070C0"/>
-          <w:sz w:val="24"/>
-        </w:rPr>
-      </w:pPr>
-      <w:r>
-        <w:rPr>
-          <w:rFonts w:eastAsia="Calibri" w:cs="Calibri"/>
-          <w:color w:val="0070C0"/>
-          <w:sz w:val="24"/>
-        </w:rPr>
-        <w:t xml:space="preserve">192 Which of the following did the customer NOT specify in his inquiry? </w:t>
+        <w:t xml:space="preserve"> type of vehicle </w:t>
+      </w:r>
+      <w:r>
+        <w:rPr>
+          <w:rFonts w:eastAsia="Calibri" w:cs="Calibri"/>
+          <w:sz w:val="24"/>
+        </w:rPr>
+        <w:tab/>
+      </w:r>
+      <w:r>
+        <w:rPr>
+          <w:rFonts w:eastAsia="Calibri" w:cs="Calibri"/>
+          <w:sz w:val="24"/>
+        </w:rPr>
+        <w:tab/>
+        <w:t>B the pick-up place</w:t>
+      </w:r>
+      <w:r>
+        <w:rPr>
+          <w:rFonts w:eastAsia="Calibri" w:cs="Calibri"/>
+          <w:sz w:val="24"/>
+        </w:rPr>
+        <w:tab/>
+      </w:r>
+    </w:p>
+    <w:p>
+      <w:pPr>
+        <w:spacing w:after="0"/>
+        <w:rPr>
+          <w:rFonts w:eastAsia="Calibri" w:cs="Calibri"/>
+          <w:sz w:val="24"/>
+        </w:rPr>
+      </w:pPr>
+      <w:r>
+        <w:rPr>
+          <w:rFonts w:eastAsia="Calibri" w:cs="Calibri"/>
+          <w:sz w:val="24"/>
+        </w:rPr>
+        <w:t xml:space="preserve">C </w:t>
+      </w:r>
+      <w:r>
+        <w:rPr>
+          <w:rFonts w:eastAsia="Calibri" w:cs="Calibri"/>
+          <w:sz w:val="24"/>
+          <w:highlight w:val="red"/>
+        </w:rPr>
+        <w:t>the rental agency</w:t>
+      </w:r>
+      <w:r>
+        <w:rPr>
+          <w:rFonts w:eastAsia="Calibri" w:cs="Calibri"/>
+          <w:sz w:val="24"/>
+        </w:rPr>
+        <w:tab/>
+      </w:r>
+      <w:r>
+        <w:rPr>
+          <w:rFonts w:eastAsia="Calibri" w:cs="Calibri"/>
+          <w:sz w:val="24"/>
+        </w:rPr>
+        <w:tab/>
+        <w:t xml:space="preserve">D </w:t>
+      </w:r>
+      <w:r>
+        <w:rPr>
+          <w:rFonts w:eastAsia="Calibri" w:cs="Calibri"/>
+          <w:sz w:val="24"/>
+          <w:highlight w:val="yellow"/>
+        </w:rPr>
+        <w:t>the drop-off time</w:t>
+      </w:r>
+      <w:r>
+        <w:rPr>
+          <w:rFonts w:eastAsia="Calibri" w:cs="Calibri"/>
+          <w:sz w:val="24"/>
+        </w:rPr>
+        <w:t xml:space="preserve"> </w:t>
+      </w:r>
+    </w:p>
+    <w:p>
+      <w:pPr>
+        <w:spacing w:after="0"/>
+        <w:rPr>
+          <w:rFonts w:eastAsia="Calibri" w:cs="Calibri"/>
+          <w:color w:val="0070C0"/>
+          <w:sz w:val="24"/>
+        </w:rPr>
+      </w:pPr>
+    </w:p>
+    <w:p>
+      <w:pPr>
+        <w:spacing w:after="0"/>
+        <w:rPr>
+          <w:rFonts w:eastAsia="Calibri" w:cs="Calibri"/>
+          <w:color w:val="0070C0"/>
+          <w:sz w:val="24"/>
+        </w:rPr>
+      </w:pPr>
+      <w:r>
+        <w:rPr>
+          <w:rFonts w:eastAsia="Calibri" w:cs="Calibri"/>
+          <w:color w:val="0070C0"/>
+          <w:sz w:val="24"/>
+        </w:rPr>
+        <w:t>193 Why did the customer most likely change the drop-off time?</w:t>
+      </w:r>
+    </w:p>
+    <w:p>
+      <w:pPr>
+        <w:spacing w:after="0"/>
+        <w:rPr>
+          <w:rFonts w:eastAsia="Calibri" w:cs="Calibri"/>
+          <w:sz w:val="24"/>
+        </w:rPr>
+      </w:pPr>
+      <w:r>
+        <w:rPr>
+          <w:rFonts w:eastAsia="Calibri" w:cs="Calibri"/>
+          <w:sz w:val="24"/>
+        </w:rPr>
+        <w:t xml:space="preserve">A </w:t>
+      </w:r>
+      <w:r>
+        <w:rPr>
+          <w:rFonts w:eastAsia="Calibri" w:cs="Calibri"/>
+          <w:sz w:val="24"/>
+          <w:highlight w:val="yellow"/>
+        </w:rPr>
+        <w:t>to receive the 20% off discount</w:t>
+      </w:r>
+      <w:r>
+        <w:rPr>
+          <w:rFonts w:eastAsia="Calibri" w:cs="Calibri"/>
+          <w:sz w:val="24"/>
+        </w:rPr>
+        <w:tab/>
+      </w:r>
+      <w:r>
+        <w:rPr>
+          <w:rFonts w:eastAsia="Calibri" w:cs="Calibri"/>
+          <w:sz w:val="24"/>
+        </w:rPr>
+        <w:tab/>
+        <w:t>B to benefit from the shuttle service</w:t>
+      </w:r>
+      <w:r>
+        <w:rPr>
+          <w:rFonts w:eastAsia="Calibri" w:cs="Calibri"/>
+          <w:sz w:val="24"/>
+        </w:rPr>
+        <w:tab/>
+      </w:r>
+      <w:r>
+        <w:rPr>
+          <w:rFonts w:eastAsia="Calibri" w:cs="Calibri"/>
+          <w:sz w:val="24"/>
+        </w:rPr>
+        <w:tab/>
+      </w:r>
+    </w:p>
+    <w:p>
+      <w:pPr>
+        <w:spacing w:after="0"/>
+        <w:rPr>
+          <w:rFonts w:eastAsia="Calibri" w:cs="Calibri"/>
+          <w:sz w:val="24"/>
+        </w:rPr>
+      </w:pPr>
+      <w:r>
+        <w:rPr>
+          <w:rFonts w:eastAsia="Calibri" w:cs="Calibri"/>
+          <w:sz w:val="24"/>
+        </w:rPr>
+        <w:t>C to avoid paying a deposit</w:t>
+      </w:r>
+      <w:r>
+        <w:rPr>
+          <w:rFonts w:eastAsia="Calibri" w:cs="Calibri"/>
+          <w:sz w:val="24"/>
+        </w:rPr>
+        <w:tab/>
+      </w:r>
+      <w:r>
+        <w:rPr>
+          <w:rFonts w:eastAsia="Calibri" w:cs="Calibri"/>
+          <w:sz w:val="24"/>
+        </w:rPr>
+        <w:tab/>
+      </w:r>
+      <w:r>
+        <w:rPr>
+          <w:rFonts w:eastAsia="Calibri" w:cs="Calibri"/>
+          <w:sz w:val="24"/>
+        </w:rPr>
+        <w:tab/>
+        <w:t xml:space="preserve">D to get a bigger vehicle </w:t>
+      </w:r>
+    </w:p>
+    <w:p>
+      <w:pPr>
+        <w:spacing w:after="0"/>
+        <w:rPr>
+          <w:rFonts w:eastAsia="Calibri" w:cs="Calibri"/>
+          <w:color w:val="0070C0"/>
+          <w:sz w:val="24"/>
+        </w:rPr>
+      </w:pPr>
+    </w:p>
+    <w:p>
+      <w:pPr>
+        <w:spacing w:after="0"/>
+        <w:rPr>
+          <w:rFonts w:eastAsia="Calibri" w:cs="Calibri"/>
+          <w:color w:val="0070C0"/>
+          <w:sz w:val="24"/>
+        </w:rPr>
+      </w:pPr>
+      <w:r>
+        <w:rPr>
+          <w:rFonts w:eastAsia="Calibri" w:cs="Calibri"/>
+          <w:color w:val="0070C0"/>
+          <w:sz w:val="24"/>
+        </w:rPr>
+        <w:t>194 What is HK Mobiles?</w:t>
       </w:r>
     </w:p>
     <w:p>
@@ -29966,7 +31515,7 @@
           <w:rFonts w:eastAsia="Calibri" w:cs="Calibri"/>
           <w:sz w:val="24"/>
         </w:rPr>
-        <w:t>A the</w:t>
+        <w:t>A</w:t>
       </w:r>
       <w:proofErr w:type="gramEnd"/>
       <w:r>
@@ -29974,199 +31523,130 @@
           <w:rFonts w:eastAsia="Calibri" w:cs="Calibri"/>
           <w:sz w:val="24"/>
         </w:rPr>
-        <w:t xml:space="preserve"> type of vehicle </w:t>
-      </w:r>
-      <w:r>
-        <w:rPr>
-          <w:rFonts w:eastAsia="Calibri" w:cs="Calibri"/>
-          <w:sz w:val="24"/>
-        </w:rPr>
-        <w:tab/>
-      </w:r>
-      <w:r>
-        <w:rPr>
-          <w:rFonts w:eastAsia="Calibri" w:cs="Calibri"/>
-          <w:sz w:val="24"/>
-        </w:rPr>
-        <w:tab/>
-        <w:t>B the pick-up place</w:t>
-      </w:r>
-      <w:r>
-        <w:rPr>
-          <w:rFonts w:eastAsia="Calibri" w:cs="Calibri"/>
-          <w:sz w:val="24"/>
-        </w:rPr>
-        <w:tab/>
-      </w:r>
-    </w:p>
-    <w:p>
-      <w:pPr>
-        <w:spacing w:after="0"/>
-        <w:rPr>
-          <w:rFonts w:eastAsia="Calibri" w:cs="Calibri"/>
-          <w:sz w:val="24"/>
-        </w:rPr>
-      </w:pPr>
-      <w:r>
-        <w:rPr>
-          <w:rFonts w:eastAsia="Calibri" w:cs="Calibri"/>
-          <w:sz w:val="24"/>
-        </w:rPr>
-        <w:t>C the rental agency</w:t>
-      </w:r>
-      <w:r>
-        <w:rPr>
-          <w:rFonts w:eastAsia="Calibri" w:cs="Calibri"/>
-          <w:sz w:val="24"/>
-        </w:rPr>
-        <w:tab/>
-      </w:r>
-      <w:r>
-        <w:rPr>
-          <w:rFonts w:eastAsia="Calibri" w:cs="Calibri"/>
-          <w:sz w:val="24"/>
-        </w:rPr>
-        <w:tab/>
-        <w:t xml:space="preserve">D the drop-off time </w:t>
-      </w:r>
-    </w:p>
-    <w:p>
-      <w:pPr>
-        <w:spacing w:after="0"/>
-        <w:rPr>
-          <w:rFonts w:eastAsia="Calibri" w:cs="Calibri"/>
-          <w:color w:val="0070C0"/>
-          <w:sz w:val="24"/>
-        </w:rPr>
-      </w:pPr>
-    </w:p>
-    <w:p>
-      <w:pPr>
-        <w:spacing w:after="0"/>
-        <w:rPr>
-          <w:rFonts w:eastAsia="Calibri" w:cs="Calibri"/>
-          <w:color w:val="0070C0"/>
-          <w:sz w:val="24"/>
-        </w:rPr>
-      </w:pPr>
-      <w:r>
-        <w:rPr>
-          <w:rFonts w:eastAsia="Calibri" w:cs="Calibri"/>
-          <w:color w:val="0070C0"/>
-          <w:sz w:val="24"/>
-        </w:rPr>
-        <w:t>193 Why did the customer most likely change the drop-off time?</w:t>
-      </w:r>
-    </w:p>
-    <w:p>
-      <w:pPr>
-        <w:spacing w:after="0"/>
-        <w:rPr>
-          <w:rFonts w:eastAsia="Calibri" w:cs="Calibri"/>
-          <w:sz w:val="24"/>
-        </w:rPr>
-      </w:pPr>
-      <w:r>
-        <w:rPr>
-          <w:rFonts w:eastAsia="Calibri" w:cs="Calibri"/>
-          <w:sz w:val="24"/>
-        </w:rPr>
-        <w:t>A to receive the 20% off discount</w:t>
-      </w:r>
-      <w:r>
-        <w:rPr>
-          <w:rFonts w:eastAsia="Calibri" w:cs="Calibri"/>
-          <w:sz w:val="24"/>
-        </w:rPr>
-        <w:tab/>
-      </w:r>
-      <w:r>
-        <w:rPr>
-          <w:rFonts w:eastAsia="Calibri" w:cs="Calibri"/>
-          <w:sz w:val="24"/>
-        </w:rPr>
-        <w:tab/>
-        <w:t>B to benefit from the shuttle service</w:t>
-      </w:r>
-      <w:r>
-        <w:rPr>
-          <w:rFonts w:eastAsia="Calibri" w:cs="Calibri"/>
-          <w:sz w:val="24"/>
-        </w:rPr>
-        <w:tab/>
-      </w:r>
-      <w:r>
-        <w:rPr>
-          <w:rFonts w:eastAsia="Calibri" w:cs="Calibri"/>
-          <w:sz w:val="24"/>
-        </w:rPr>
-        <w:tab/>
-      </w:r>
-    </w:p>
-    <w:p>
-      <w:pPr>
-        <w:spacing w:after="0"/>
-        <w:rPr>
-          <w:rFonts w:eastAsia="Calibri" w:cs="Calibri"/>
-          <w:sz w:val="24"/>
-        </w:rPr>
-      </w:pPr>
-      <w:r>
-        <w:rPr>
-          <w:rFonts w:eastAsia="Calibri" w:cs="Calibri"/>
-          <w:sz w:val="24"/>
-        </w:rPr>
-        <w:t>C to avoid paying a deposit</w:t>
-      </w:r>
-      <w:r>
-        <w:rPr>
-          <w:rFonts w:eastAsia="Calibri" w:cs="Calibri"/>
-          <w:sz w:val="24"/>
-        </w:rPr>
-        <w:tab/>
-      </w:r>
-      <w:r>
-        <w:rPr>
-          <w:rFonts w:eastAsia="Calibri" w:cs="Calibri"/>
-          <w:sz w:val="24"/>
-        </w:rPr>
-        <w:tab/>
-      </w:r>
-      <w:r>
-        <w:rPr>
-          <w:rFonts w:eastAsia="Calibri" w:cs="Calibri"/>
-          <w:sz w:val="24"/>
-        </w:rPr>
-        <w:tab/>
-        <w:t xml:space="preserve">D to get a bigger vehicle </w:t>
-      </w:r>
-    </w:p>
-    <w:p>
-      <w:pPr>
-        <w:spacing w:after="0"/>
-        <w:rPr>
-          <w:rFonts w:eastAsia="Calibri" w:cs="Calibri"/>
-          <w:color w:val="0070C0"/>
-          <w:sz w:val="24"/>
-        </w:rPr>
-      </w:pPr>
-    </w:p>
-    <w:p>
-      <w:pPr>
-        <w:spacing w:after="0"/>
-        <w:rPr>
-          <w:rFonts w:eastAsia="Calibri" w:cs="Calibri"/>
-          <w:color w:val="0070C0"/>
-          <w:sz w:val="24"/>
-        </w:rPr>
-      </w:pPr>
-      <w:r>
-        <w:rPr>
-          <w:rFonts w:eastAsia="Calibri" w:cs="Calibri"/>
-          <w:color w:val="0070C0"/>
-          <w:sz w:val="24"/>
-        </w:rPr>
-        <w:t>194 What is HK Mobiles?</w:t>
+        <w:t xml:space="preserve"> </w:t>
+      </w:r>
+      <w:proofErr w:type="spellStart"/>
+      <w:r>
+        <w:rPr>
+          <w:rFonts w:eastAsia="Calibri" w:cs="Calibri"/>
+          <w:sz w:val="24"/>
+          <w:highlight w:val="yellow"/>
+        </w:rPr>
+        <w:t>a</w:t>
+      </w:r>
+      <w:proofErr w:type="spellEnd"/>
+      <w:r>
+        <w:rPr>
+          <w:rFonts w:eastAsia="Calibri" w:cs="Calibri"/>
+          <w:sz w:val="24"/>
+          <w:highlight w:val="yellow"/>
+        </w:rPr>
+        <w:t xml:space="preserve"> rental agent on the Arrivals level</w:t>
+      </w:r>
+      <w:r>
+        <w:rPr>
+          <w:rFonts w:eastAsia="Calibri" w:cs="Calibri"/>
+          <w:sz w:val="24"/>
+        </w:rPr>
+        <w:t xml:space="preserve"> </w:t>
+      </w:r>
+    </w:p>
+    <w:p>
+      <w:pPr>
+        <w:spacing w:after="0"/>
+        <w:rPr>
+          <w:rFonts w:eastAsia="Calibri" w:cs="Calibri"/>
+          <w:sz w:val="24"/>
+        </w:rPr>
+      </w:pPr>
+      <w:r>
+        <w:rPr>
+          <w:rFonts w:eastAsia="Calibri" w:cs="Calibri"/>
+          <w:sz w:val="24"/>
+        </w:rPr>
+        <w:t xml:space="preserve">B a shuttle service offered by the airport </w:t>
+      </w:r>
+    </w:p>
+    <w:p>
+      <w:pPr>
+        <w:spacing w:after="0"/>
+        <w:rPr>
+          <w:rFonts w:eastAsia="Calibri" w:cs="Calibri"/>
+          <w:sz w:val="24"/>
+        </w:rPr>
+      </w:pPr>
+      <w:r>
+        <w:rPr>
+          <w:rFonts w:eastAsia="Calibri" w:cs="Calibri"/>
+          <w:sz w:val="24"/>
+        </w:rPr>
+        <w:t xml:space="preserve">C the type of vehicle the customer selected  </w:t>
+      </w:r>
+      <w:r>
+        <w:rPr>
+          <w:rFonts w:eastAsia="Calibri" w:cs="Calibri"/>
+          <w:sz w:val="24"/>
+        </w:rPr>
+        <w:tab/>
+      </w:r>
+      <w:r>
+        <w:rPr>
+          <w:rFonts w:eastAsia="Calibri" w:cs="Calibri"/>
+          <w:sz w:val="24"/>
+        </w:rPr>
+        <w:tab/>
+      </w:r>
+    </w:p>
+    <w:p>
+      <w:pPr>
+        <w:spacing w:after="0"/>
+        <w:rPr>
+          <w:rFonts w:eastAsia="Calibri" w:cs="Calibri"/>
+          <w:sz w:val="24"/>
+        </w:rPr>
+      </w:pPr>
+      <w:r>
+        <w:rPr>
+          <w:rFonts w:eastAsia="Calibri" w:cs="Calibri"/>
+          <w:sz w:val="24"/>
+        </w:rPr>
+        <w:t xml:space="preserve">D </w:t>
+      </w:r>
+      <w:r>
+        <w:rPr>
+          <w:rFonts w:eastAsia="Calibri" w:cs="Calibri"/>
+          <w:sz w:val="24"/>
+          <w:highlight w:val="red"/>
+        </w:rPr>
+        <w:t>an agency near the Hong Kong airport</w:t>
+      </w:r>
+    </w:p>
+    <w:p>
+      <w:pPr>
+        <w:spacing w:after="0"/>
+        <w:rPr>
+          <w:rFonts w:eastAsia="Calibri" w:cs="Calibri"/>
+          <w:color w:val="0070C0"/>
+          <w:sz w:val="24"/>
+        </w:rPr>
+      </w:pPr>
+    </w:p>
+    <w:p>
+      <w:pPr>
+        <w:spacing w:after="0"/>
+        <w:rPr>
+          <w:rFonts w:eastAsia="Calibri" w:cs="Calibri"/>
+          <w:color w:val="0070C0"/>
+          <w:sz w:val="24"/>
+        </w:rPr>
+      </w:pPr>
+      <w:r>
+        <w:rPr>
+          <w:rFonts w:eastAsia="Calibri" w:cs="Calibri"/>
+          <w:color w:val="0070C0"/>
+          <w:sz w:val="24"/>
+        </w:rPr>
+        <w:t>195 Which of the following does this customer require?</w:t>
       </w:r>
     </w:p>
     <w:p>
@@ -30207,138 +31687,6 @@
           <w:rFonts w:eastAsia="Calibri" w:cs="Calibri"/>
           <w:sz w:val="24"/>
         </w:rPr>
-        <w:t xml:space="preserve"> rental agent on the Arrivals level </w:t>
-      </w:r>
-    </w:p>
-    <w:p>
-      <w:pPr>
-        <w:spacing w:after="0"/>
-        <w:rPr>
-          <w:rFonts w:eastAsia="Calibri" w:cs="Calibri"/>
-          <w:sz w:val="24"/>
-        </w:rPr>
-      </w:pPr>
-      <w:r>
-        <w:rPr>
-          <w:rFonts w:eastAsia="Calibri" w:cs="Calibri"/>
-          <w:sz w:val="24"/>
-        </w:rPr>
-        <w:t xml:space="preserve">B a shuttle service offered by the airport </w:t>
-      </w:r>
-    </w:p>
-    <w:p>
-      <w:pPr>
-        <w:spacing w:after="0"/>
-        <w:rPr>
-          <w:rFonts w:eastAsia="Calibri" w:cs="Calibri"/>
-          <w:sz w:val="24"/>
-        </w:rPr>
-      </w:pPr>
-      <w:r>
-        <w:rPr>
-          <w:rFonts w:eastAsia="Calibri" w:cs="Calibri"/>
-          <w:sz w:val="24"/>
-        </w:rPr>
-        <w:lastRenderedPageBreak/>
-        <w:t xml:space="preserve">C the type of vehicle the customer selected  </w:t>
-      </w:r>
-      <w:r>
-        <w:rPr>
-          <w:rFonts w:eastAsia="Calibri" w:cs="Calibri"/>
-          <w:sz w:val="24"/>
-        </w:rPr>
-        <w:tab/>
-      </w:r>
-      <w:r>
-        <w:rPr>
-          <w:rFonts w:eastAsia="Calibri" w:cs="Calibri"/>
-          <w:sz w:val="24"/>
-        </w:rPr>
-        <w:tab/>
-      </w:r>
-    </w:p>
-    <w:p>
-      <w:pPr>
-        <w:spacing w:after="0"/>
-        <w:rPr>
-          <w:rFonts w:eastAsia="Calibri" w:cs="Calibri"/>
-          <w:sz w:val="24"/>
-        </w:rPr>
-      </w:pPr>
-      <w:r>
-        <w:rPr>
-          <w:rFonts w:eastAsia="Calibri" w:cs="Calibri"/>
-          <w:sz w:val="24"/>
-        </w:rPr>
-        <w:t>D an agency near the Hong Kong airport</w:t>
-      </w:r>
-    </w:p>
-    <w:p>
-      <w:pPr>
-        <w:spacing w:after="0"/>
-        <w:rPr>
-          <w:rFonts w:eastAsia="Calibri" w:cs="Calibri"/>
-          <w:color w:val="0070C0"/>
-          <w:sz w:val="24"/>
-        </w:rPr>
-      </w:pPr>
-    </w:p>
-    <w:p>
-      <w:pPr>
-        <w:spacing w:after="0"/>
-        <w:rPr>
-          <w:rFonts w:eastAsia="Calibri" w:cs="Calibri"/>
-          <w:color w:val="0070C0"/>
-          <w:sz w:val="24"/>
-        </w:rPr>
-      </w:pPr>
-      <w:r>
-        <w:rPr>
-          <w:rFonts w:eastAsia="Calibri" w:cs="Calibri"/>
-          <w:color w:val="0070C0"/>
-          <w:sz w:val="24"/>
-        </w:rPr>
-        <w:t>195 Which of the following does this customer require?</w:t>
-      </w:r>
-    </w:p>
-    <w:p>
-      <w:pPr>
-        <w:spacing w:after="0"/>
-        <w:rPr>
-          <w:rFonts w:eastAsia="Calibri" w:cs="Calibri"/>
-          <w:sz w:val="24"/>
-        </w:rPr>
-      </w:pPr>
-      <w:proofErr w:type="gramStart"/>
-      <w:r>
-        <w:rPr>
-          <w:rFonts w:eastAsia="Calibri" w:cs="Calibri"/>
-          <w:sz w:val="24"/>
-        </w:rPr>
-        <w:t>A</w:t>
-      </w:r>
-      <w:proofErr w:type="gramEnd"/>
-      <w:r>
-        <w:rPr>
-          <w:rFonts w:eastAsia="Calibri" w:cs="Calibri"/>
-          <w:sz w:val="24"/>
-        </w:rPr>
-        <w:t xml:space="preserve"> </w:t>
-      </w:r>
-      <w:proofErr w:type="spellStart"/>
-      <w:r>
-        <w:rPr>
-          <w:rFonts w:eastAsia="Calibri" w:cs="Calibri"/>
-          <w:sz w:val="24"/>
-        </w:rPr>
-        <w:t>a</w:t>
-      </w:r>
-      <w:proofErr w:type="spellEnd"/>
-      <w:r>
-        <w:rPr>
-          <w:rFonts w:eastAsia="Calibri" w:cs="Calibri"/>
-          <w:sz w:val="24"/>
-        </w:rPr>
         <w:t xml:space="preserve"> vehicle that seats seven </w:t>
       </w:r>
       <w:r>
@@ -30354,7 +31702,22 @@
           <w:sz w:val="24"/>
         </w:rPr>
         <w:tab/>
-        <w:t xml:space="preserve">B a car seat for a small child  </w:t>
+        <w:t xml:space="preserve">B </w:t>
+      </w:r>
+      <w:r>
+        <w:rPr>
+          <w:rFonts w:eastAsia="Calibri" w:cs="Calibri"/>
+          <w:sz w:val="24"/>
+          <w:highlight w:val="yellow"/>
+        </w:rPr>
+        <w:t>a car seat for a small child</w:t>
+      </w:r>
+      <w:r>
+        <w:rPr>
+          <w:rFonts w:eastAsia="Calibri" w:cs="Calibri"/>
+          <w:sz w:val="24"/>
+        </w:rPr>
+        <w:t xml:space="preserve">  </w:t>
       </w:r>
     </w:p>
     <w:p>
@@ -30883,7 +32246,6 @@
           <w:rFonts w:eastAsia="Calibri" w:cs="Calibri"/>
           <w:sz w:val="24"/>
         </w:rPr>
-        <w:lastRenderedPageBreak/>
         <w:t>I look forward to hearing from you.</w:t>
       </w:r>
     </w:p>
@@ -30928,6 +32290,7 @@
           <w:rFonts w:eastAsia="Calibri" w:cs="Calibri"/>
           <w:sz w:val="24"/>
         </w:rPr>
+        <w:lastRenderedPageBreak/>
         <w:t xml:space="preserve">Sam </w:t>
       </w:r>
       <w:proofErr w:type="spellStart"/>
@@ -31346,7 +32709,15 @@
           <w:sz w:val="24"/>
         </w:rPr>
         <w:tab/>
-        <w:t>D insurance sales</w:t>
+        <w:t xml:space="preserve">D </w:t>
+      </w:r>
+      <w:r>
+        <w:rPr>
+          <w:rFonts w:eastAsia="Calibri" w:cs="Calibri"/>
+          <w:sz w:val="24"/>
+          <w:highlight w:val="yellow"/>
+        </w:rPr>
+        <w:t>insurance sales</w:t>
       </w:r>
     </w:p>
     <w:p>
@@ -31413,7 +32784,15 @@
           <w:sz w:val="24"/>
         </w:rPr>
         <w:tab/>
-        <w:t>B salary</w:t>
+        <w:t xml:space="preserve">B </w:t>
+      </w:r>
+      <w:r>
+        <w:rPr>
+          <w:rFonts w:eastAsia="Calibri" w:cs="Calibri"/>
+          <w:sz w:val="24"/>
+          <w:highlight w:val="yellow"/>
+        </w:rPr>
+        <w:t>salary</w:t>
       </w:r>
       <w:r>
         <w:rPr>
@@ -31505,7 +32884,6 @@
           <w:rFonts w:eastAsia="Calibri" w:cs="Calibri"/>
           <w:sz w:val="24"/>
         </w:rPr>
-        <w:lastRenderedPageBreak/>
         <w:t>A to offer employment to someone</w:t>
       </w:r>
       <w:r>
@@ -31552,7 +32930,15 @@
           <w:rFonts w:eastAsia="Calibri" w:cs="Calibri"/>
           <w:sz w:val="24"/>
         </w:rPr>
-        <w:t>C to express interest in applying for a job</w:t>
+        <w:t xml:space="preserve">C </w:t>
+      </w:r>
+      <w:r>
+        <w:rPr>
+          <w:rFonts w:eastAsia="Calibri" w:cs="Calibri"/>
+          <w:sz w:val="24"/>
+          <w:highlight w:val="yellow"/>
+        </w:rPr>
+        <w:t>to express interest in applying for a job</w:t>
       </w:r>
       <w:r>
         <w:rPr>
@@ -31629,7 +33015,15 @@
           <w:rFonts w:eastAsia="Calibri" w:cs="Calibri"/>
           <w:sz w:val="24"/>
         </w:rPr>
-        <w:t>A he is a team leader</w:t>
+        <w:t xml:space="preserve">A </w:t>
+      </w:r>
+      <w:r>
+        <w:rPr>
+          <w:rFonts w:eastAsia="Calibri" w:cs="Calibri"/>
+          <w:sz w:val="24"/>
+          <w:highlight w:val="yellow"/>
+        </w:rPr>
+        <w:t>he is a team leader</w:t>
       </w:r>
       <w:r>
         <w:rPr>
@@ -31667,7 +33061,22 @@
           <w:rFonts w:eastAsia="Calibri" w:cs="Calibri"/>
           <w:sz w:val="24"/>
         </w:rPr>
-        <w:t xml:space="preserve">C he talks easily with strangers   </w:t>
+        <w:t xml:space="preserve">C </w:t>
+      </w:r>
+      <w:r>
+        <w:rPr>
+          <w:rFonts w:eastAsia="Calibri" w:cs="Calibri"/>
+          <w:sz w:val="24"/>
+          <w:highlight w:val="red"/>
+        </w:rPr>
+        <w:t>he talks easily with strangers</w:t>
+      </w:r>
+      <w:r>
+        <w:rPr>
+          <w:rFonts w:eastAsia="Calibri" w:cs="Calibri"/>
+          <w:sz w:val="24"/>
+        </w:rPr>
+        <w:t xml:space="preserve">   </w:t>
       </w:r>
       <w:r>
         <w:rPr>
@@ -31728,7 +33137,15 @@
           <w:rFonts w:eastAsia="Calibri" w:cs="Calibri"/>
           <w:sz w:val="24"/>
         </w:rPr>
-        <w:t xml:space="preserve"> after passing a test</w:t>
+        <w:t xml:space="preserve"> </w:t>
+      </w:r>
+      <w:r>
+        <w:rPr>
+          <w:rFonts w:eastAsia="Calibri" w:cs="Calibri"/>
+          <w:sz w:val="24"/>
+          <w:highlight w:val="red"/>
+        </w:rPr>
+        <w:t>after passing a test</w:t>
       </w:r>
       <w:r>
         <w:rPr>
@@ -31788,7 +33205,15 @@
           <w:sz w:val="24"/>
         </w:rPr>
         <w:tab/>
-        <w:t>D right away</w:t>
+        <w:t xml:space="preserve">D </w:t>
+      </w:r>
+      <w:r>
+        <w:rPr>
+          <w:rFonts w:eastAsia="Calibri" w:cs="Calibri"/>
+          <w:sz w:val="24"/>
+          <w:highlight w:val="yellow"/>
+        </w:rPr>
+        <w:t>right away</w:t>
       </w:r>
     </w:p>
     <w:p>
@@ -31833,7 +33258,10 @@
         </w:rPr>
       </w:pPr>
     </w:p>
-    <w:p/>
+    <w:p>
+      <w:bookmarkStart w:id="1" w:name="_GoBack"/>
+      <w:bookmarkEnd w:id="1"/>
+    </w:p>
     <w:sectPr>
       <w:headerReference w:type="even" r:id="rId18"/>
       <w:headerReference w:type="default" r:id="rId19"/>
@@ -32047,7 +33475,7 @@
             </wp:anchor>
           </w:drawing>
         </mc:Choice>
-        <mc:Fallback xmlns:cr="http://schemas.microsoft.com/office/comments/2020/reactions" xmlns="http://schemas.microsoft.com/office/tasks/2019/documenttasks" xmlns:w16cid="http://schemas.microsoft.com/office/word/2016/wordml/cid" xmlns:w16cex="http://schemas.microsoft.com/office/word/2018/wordml/cex" xmlns:w16="http://schemas.microsoft.com/office/word/2018/wordml" xmlns:dgm="http://schemas.openxmlformats.org/drawingml/2006/diagram" xmlns:lc="http://schemas.openxmlformats.org/drawingml/2006/lockedCanvas" xmlns:c="http://schemas.openxmlformats.org/drawingml/2006/chart" xmlns:pic="http://schemas.openxmlformats.org/drawingml/2006/picture" xmlns:a="http://schemas.openxmlformats.org/drawingml/2006/main" xmlns:sl="http://schemas.openxmlformats.org/schemaLibrary/2006/main">
+        <mc:Fallback xmlns:sl="http://schemas.openxmlformats.org/schemaLibrary/2006/main" xmlns:a="http://schemas.openxmlformats.org/drawingml/2006/main" xmlns:pic="http://schemas.openxmlformats.org/drawingml/2006/picture" xmlns:c="http://schemas.openxmlformats.org/drawingml/2006/chart" xmlns:lc="http://schemas.openxmlformats.org/drawingml/2006/lockedCanvas" xmlns:dgm="http://schemas.openxmlformats.org/drawingml/2006/diagram" xmlns:w16="http://schemas.microsoft.com/office/word/2018/wordml" xmlns:w16cex="http://schemas.microsoft.com/office/word/2018/wordml/cex" xmlns:w16cid="http://schemas.microsoft.com/office/word/2016/wordml/cid" xmlns="http://schemas.microsoft.com/office/tasks/2019/documenttasks" xmlns:cr="http://schemas.microsoft.com/office/comments/2020/reactions">
           <w:drawing>
             <wp:anchor allowOverlap="1" behindDoc="0" distB="0" distT="0" distL="114300" distR="114300" hidden="0" layoutInCell="1" locked="0" relativeHeight="0" simplePos="0">
               <wp:simplePos x="0" y="0"/>
@@ -32156,7 +33584,7 @@
             </wp:anchor>
           </w:drawing>
         </mc:Choice>
-        <mc:Fallback xmlns:cr="http://schemas.microsoft.com/office/comments/2020/reactions" xmlns="http://schemas.microsoft.com/office/tasks/2019/documenttasks" xmlns:w16cid="http://schemas.microsoft.com/office/word/2016/wordml/cid" xmlns:w16cex="http://schemas.microsoft.com/office/word/2018/wordml/cex" xmlns:w16="http://schemas.microsoft.com/office/word/2018/wordml" xmlns:dgm="http://schemas.openxmlformats.org/drawingml/2006/diagram" xmlns:lc="http://schemas.openxmlformats.org/drawingml/2006/lockedCanvas" xmlns:c="http://schemas.openxmlformats.org/drawingml/2006/chart" xmlns:pic="http://schemas.openxmlformats.org/drawingml/2006/picture" xmlns:a="http://schemas.openxmlformats.org/drawingml/2006/main" xmlns:sl="http://schemas.openxmlformats.org/schemaLibrary/2006/main">
+        <mc:Fallback xmlns:sl="http://schemas.openxmlformats.org/schemaLibrary/2006/main" xmlns:a="http://schemas.openxmlformats.org/drawingml/2006/main" xmlns:pic="http://schemas.openxmlformats.org/drawingml/2006/picture" xmlns:c="http://schemas.openxmlformats.org/drawingml/2006/chart" xmlns:lc="http://schemas.openxmlformats.org/drawingml/2006/lockedCanvas" xmlns:dgm="http://schemas.openxmlformats.org/drawingml/2006/diagram" xmlns:w16="http://schemas.microsoft.com/office/word/2018/wordml" xmlns:w16cex="http://schemas.microsoft.com/office/word/2018/wordml/cex" xmlns:w16cid="http://schemas.microsoft.com/office/word/2016/wordml/cid" xmlns="http://schemas.microsoft.com/office/tasks/2019/documenttasks" xmlns:cr="http://schemas.microsoft.com/office/comments/2020/reactions">
           <w:drawing>
             <wp:anchor allowOverlap="1" behindDoc="0" distB="0" distT="0" distL="114300" distR="114300" hidden="0" layoutInCell="1" locked="0" relativeHeight="0" simplePos="0">
               <wp:simplePos x="0" y="0"/>
@@ -32265,7 +33693,7 @@
             </wp:anchor>
           </w:drawing>
         </mc:Choice>
-        <mc:Fallback xmlns:cr="http://schemas.microsoft.com/office/comments/2020/reactions" xmlns="http://schemas.microsoft.com/office/tasks/2019/documenttasks" xmlns:w16cid="http://schemas.microsoft.com/office/word/2016/wordml/cid" xmlns:w16cex="http://schemas.microsoft.com/office/word/2018/wordml/cex" xmlns:w16="http://schemas.microsoft.com/office/word/2018/wordml" xmlns:dgm="http://schemas.openxmlformats.org/drawingml/2006/diagram" xmlns:lc="http://schemas.openxmlformats.org/drawingml/2006/lockedCanvas" xmlns:c="http://schemas.openxmlformats.org/drawingml/2006/chart" xmlns:pic="http://schemas.openxmlformats.org/drawingml/2006/picture" xmlns:a="http://schemas.openxmlformats.org/drawingml/2006/main" xmlns:sl="http://schemas.openxmlformats.org/schemaLibrary/2006/main">
+        <mc:Fallback xmlns:sl="http://schemas.openxmlformats.org/schemaLibrary/2006/main" xmlns:a="http://schemas.openxmlformats.org/drawingml/2006/main" xmlns:pic="http://schemas.openxmlformats.org/drawingml/2006/picture" xmlns:c="http://schemas.openxmlformats.org/drawingml/2006/chart" xmlns:lc="http://schemas.openxmlformats.org/drawingml/2006/lockedCanvas" xmlns:dgm="http://schemas.openxmlformats.org/drawingml/2006/diagram" xmlns:w16="http://schemas.microsoft.com/office/word/2018/wordml" xmlns:w16cex="http://schemas.microsoft.com/office/word/2018/wordml/cex" xmlns:w16cid="http://schemas.microsoft.com/office/word/2016/wordml/cid" xmlns="http://schemas.microsoft.com/office/tasks/2019/documenttasks" xmlns:cr="http://schemas.microsoft.com/office/comments/2020/reactions">
           <w:drawing>
             <wp:anchor allowOverlap="1" behindDoc="0" distB="0" distT="0" distL="114300" distR="114300" hidden="0" layoutInCell="1" locked="0" relativeHeight="0" simplePos="0">
               <wp:simplePos x="0" y="0"/>
@@ -32372,7 +33800,7 @@
             </wp:anchor>
           </w:drawing>
         </mc:Choice>
-        <mc:Fallback xmlns:cr="http://schemas.microsoft.com/office/comments/2020/reactions" xmlns="http://schemas.microsoft.com/office/tasks/2019/documenttasks" xmlns:w16cid="http://schemas.microsoft.com/office/word/2016/wordml/cid" xmlns:w16cex="http://schemas.microsoft.com/office/word/2018/wordml/cex" xmlns:w16="http://schemas.microsoft.com/office/word/2018/wordml" xmlns:dgm="http://schemas.openxmlformats.org/drawingml/2006/diagram" xmlns:lc="http://schemas.openxmlformats.org/drawingml/2006/lockedCanvas" xmlns:c="http://schemas.openxmlformats.org/drawingml/2006/chart" xmlns:pic="http://schemas.openxmlformats.org/drawingml/2006/picture" xmlns:a="http://schemas.openxmlformats.org/drawingml/2006/main" xmlns:sl="http://schemas.openxmlformats.org/schemaLibrary/2006/main">
+        <mc:Fallback xmlns:sl="http://schemas.openxmlformats.org/schemaLibrary/2006/main" xmlns:a="http://schemas.openxmlformats.org/drawingml/2006/main" xmlns:pic="http://schemas.openxmlformats.org/drawingml/2006/picture" xmlns:c="http://schemas.openxmlformats.org/drawingml/2006/chart" xmlns:lc="http://schemas.openxmlformats.org/drawingml/2006/lockedCanvas" xmlns:dgm="http://schemas.openxmlformats.org/drawingml/2006/diagram" xmlns:w16="http://schemas.microsoft.com/office/word/2018/wordml" xmlns:w16cex="http://schemas.microsoft.com/office/word/2018/wordml/cex" xmlns:w16cid="http://schemas.microsoft.com/office/word/2016/wordml/cid" xmlns="http://schemas.microsoft.com/office/tasks/2019/documenttasks" xmlns:cr="http://schemas.microsoft.com/office/comments/2020/reactions">
           <w:drawing>
             <wp:anchor allowOverlap="1" behindDoc="0" distB="45720" distT="45720" distL="114300" distR="114300" hidden="0" layoutInCell="1" locked="0" relativeHeight="0" simplePos="0">
               <wp:simplePos x="0" y="0"/>
@@ -33477,9 +34905,7 @@
       <w:tblStyleRowBandSize w:val="1"/>
       <w:tblStyleColBandSize w:val="1"/>
       <w:tblCellMar>
-        <w:top w:w="0" w:type="dxa"/>
         <w:left w:w="108" w:type="dxa"/>
-        <w:bottom w:w="0" w:type="dxa"/>
         <w:right w:w="108" w:type="dxa"/>
       </w:tblCellMar>
     </w:tblPr>
@@ -33493,9 +34919,7 @@
       <w:tblStyleRowBandSize w:val="1"/>
       <w:tblStyleColBandSize w:val="1"/>
       <w:tblCellMar>
-        <w:top w:w="0" w:type="dxa"/>
         <w:left w:w="108" w:type="dxa"/>
-        <w:bottom w:w="0" w:type="dxa"/>
         <w:right w:w="108" w:type="dxa"/>
       </w:tblCellMar>
     </w:tblPr>
@@ -33509,9 +34933,7 @@
       <w:tblStyleRowBandSize w:val="1"/>
       <w:tblStyleColBandSize w:val="1"/>
       <w:tblCellMar>
-        <w:top w:w="0" w:type="dxa"/>
         <w:left w:w="108" w:type="dxa"/>
-        <w:bottom w:w="0" w:type="dxa"/>
         <w:right w:w="108" w:type="dxa"/>
       </w:tblCellMar>
     </w:tblPr>
@@ -33525,9 +34947,7 @@
       <w:tblStyleRowBandSize w:val="1"/>
       <w:tblStyleColBandSize w:val="1"/>
       <w:tblCellMar>
-        <w:top w:w="0" w:type="dxa"/>
         <w:left w:w="108" w:type="dxa"/>
-        <w:bottom w:w="0" w:type="dxa"/>
         <w:right w:w="108" w:type="dxa"/>
       </w:tblCellMar>
     </w:tblPr>
@@ -33541,9 +34961,7 @@
       <w:tblStyleRowBandSize w:val="1"/>
       <w:tblStyleColBandSize w:val="1"/>
       <w:tblCellMar>
-        <w:top w:w="0" w:type="dxa"/>
         <w:left w:w="108" w:type="dxa"/>
-        <w:bottom w:w="0" w:type="dxa"/>
         <w:right w:w="108" w:type="dxa"/>
       </w:tblCellMar>
     </w:tblPr>
@@ -33557,9 +34975,7 @@
       <w:tblStyleRowBandSize w:val="1"/>
       <w:tblStyleColBandSize w:val="1"/>
       <w:tblCellMar>
-        <w:top w:w="0" w:type="dxa"/>
         <w:left w:w="108" w:type="dxa"/>
-        <w:bottom w:w="0" w:type="dxa"/>
         <w:right w:w="108" w:type="dxa"/>
       </w:tblCellMar>
     </w:tblPr>
@@ -33573,9 +34989,7 @@
       <w:tblStyleRowBandSize w:val="1"/>
       <w:tblStyleColBandSize w:val="1"/>
       <w:tblCellMar>
-        <w:top w:w="0" w:type="dxa"/>
         <w:left w:w="108" w:type="dxa"/>
-        <w:bottom w:w="0" w:type="dxa"/>
         <w:right w:w="108" w:type="dxa"/>
       </w:tblCellMar>
     </w:tblPr>
@@ -33589,9 +35003,7 @@
       <w:tblStyleRowBandSize w:val="1"/>
       <w:tblStyleColBandSize w:val="1"/>
       <w:tblCellMar>
-        <w:top w:w="0" w:type="dxa"/>
         <w:left w:w="108" w:type="dxa"/>
-        <w:bottom w:w="0" w:type="dxa"/>
         <w:right w:w="108" w:type="dxa"/>
       </w:tblCellMar>
     </w:tblPr>
@@ -33605,9 +35017,7 @@
       <w:tblStyleRowBandSize w:val="1"/>
       <w:tblStyleColBandSize w:val="1"/>
       <w:tblCellMar>
-        <w:top w:w="0" w:type="dxa"/>
         <w:left w:w="108" w:type="dxa"/>
-        <w:bottom w:w="0" w:type="dxa"/>
         <w:right w:w="108" w:type="dxa"/>
       </w:tblCellMar>
     </w:tblPr>
@@ -33621,9 +35031,7 @@
       <w:tblStyleRowBandSize w:val="1"/>
       <w:tblStyleColBandSize w:val="1"/>
       <w:tblCellMar>
-        <w:top w:w="0" w:type="dxa"/>
         <w:left w:w="108" w:type="dxa"/>
-        <w:bottom w:w="0" w:type="dxa"/>
         <w:right w:w="108" w:type="dxa"/>
       </w:tblCellMar>
     </w:tblPr>

</xml_diff>